<commit_message>
feat: implement project management system with modal, state store, and validation engine components
</commit_message>
<xml_diff>
--- a/elera_fyp1_IEEE.docx
+++ b/elera_fyp1_IEEE.docx
@@ -60,25 +60,7 @@
           <w:sz w:val="18"/>
           <w:szCs w:val="18"/>
         </w:rPr>
-        <w:t xml:space="preserve">Mohamad Imad </w:t>
-      </w:r>
-      <w:proofErr w:type="spellStart"/>
-      <w:r>
-        <w:rPr>
-          <w:rFonts w:cs="Times New Roman"/>
-          <w:sz w:val="18"/>
-          <w:szCs w:val="18"/>
-        </w:rPr>
-        <w:t>Addin</w:t>
-      </w:r>
-      <w:proofErr w:type="spellEnd"/>
-      <w:r>
-        <w:rPr>
-          <w:rFonts w:cs="Times New Roman"/>
-          <w:sz w:val="18"/>
-          <w:szCs w:val="18"/>
-        </w:rPr>
-        <w:t xml:space="preserve"> bin Ja'far</w:t>
+        <w:t>Mohamad Imad Addin bin Ja'far</w:t>
       </w:r>
       <w:r>
         <w:rPr>
@@ -356,8 +338,37 @@
           <w:sz w:val="18"/>
           <w:szCs w:val="18"/>
         </w:rPr>
-        <w:t>A</w:t>
-      </w:r>
+        <w:t>Abstract</w:t>
+      </w:r>
+      <w:r>
+        <w:rPr>
+          <w:rFonts w:cs="Times New Roman"/>
+          <w:b/>
+          <w:bCs/>
+          <w:sz w:val="18"/>
+          <w:szCs w:val="18"/>
+        </w:rPr>
+        <w:t>—</w:t>
+      </w:r>
+      <w:r>
+        <w:t xml:space="preserve"> </w:t>
+      </w:r>
+      <w:r>
+        <w:rPr>
+          <w:rFonts w:cs="Times New Roman"/>
+          <w:b/>
+          <w:bCs/>
+          <w:sz w:val="18"/>
+          <w:szCs w:val="18"/>
+        </w:rPr>
+        <w:t xml:space="preserve">Arduino has become a standard platform for teaching electronics and embedded systems in universities. However, beginner students continue to make common circuit wiring errors that existing tools do not catch during the design phase. Errors such as connecting LEDs without current-limiting resistors, exceeding the Arduino Uno’s 500 mA USB current limit, assigning multiple components to the same I/O pin, and wiring I2C devices to incorrect analogue pins are frequent among novice learners. Popular web-based tools like Tinkercad Circuits, Wokwi, and Fritzing allow students to build circuits virtually, but they only reveal errors after simulation or not at all. None of them validate wiring during design or explain why a mistake occurred. This paper presents Elera, an intelligent web-based Arduino circuit design assistant that provides real-time, rule-based validation and beginner-friendly feedback within the design environment. Elera includes a drag-and-drop circuit canvas, a metadata-driven component library covering 14 common Arduino parts, a validation engine that checks nine categories of electrical errors, an auto-wiring engine that assigns correct Arduino pins based on each component’s electrical requirements, an AI assistant that accepts natural language circuit descriptions, and a component builder that allows users to import custom component images with AI-assisted pin detection. The application runs entirely in the browser with no installation required. </w:t>
+      </w:r>
+    </w:p>
+    <w:p>
+      <w:pPr>
+        <w:spacing w:after="120" w:line="228" w:lineRule="auto"/>
+        <w:ind w:firstLine="274"/>
+      </w:pPr>
       <w:r>
         <w:rPr>
           <w:rFonts w:cs="Times New Roman"/>
@@ -368,34 +379,6 @@
           <w:sz w:val="18"/>
           <w:szCs w:val="18"/>
         </w:rPr>
-        <w:t>bstract</w:t>
-      </w:r>
-      <w:r>
-        <w:rPr>
-          <w:rFonts w:cs="Times New Roman"/>
-          <w:b/>
-          <w:bCs/>
-          <w:sz w:val="18"/>
-          <w:szCs w:val="18"/>
-        </w:rPr>
-        <w:t>—Arduino has become a standard platform for teaching electronics and embedded systems in universities. However, beginner students continue to make common circuit wiring errors that existing tools do not catch during the design phase. Errors such as connecting LEDs without current-limiting resistors, exceeding the Arduino Uno's 500 mA USB current limit, assigning multiple components to the same I/O pin, and wiring I2C devices to incorrect analogue pins are frequent among novice learners. Popular web-based tools like Tinkercad Circuits, Wokwi, and Fritzing allow students to build circuits virtually, but they only reveal errors after simulation or not at all. None of them validate wiring during design or explain why a mistake occurred. This paper presents the pre-production design of Elera, an intelligent web-based Arduino circuit design assistant that provides real-time, rule-based validation and beginner-friendly feedback within the design environment. Elera is designed to include a drag-and-drop circuit canvas, a metadata-driven component library covering 14 common Arduino parts, a validation engine that checks nine categories of electrical errors, and an auto-wiring engine that assigns correct Arduino pins based on each component's electrical requirements. The system design uses Lit 3, Vite 6, and the Wokwi elements library, and the application is designed to run entirely in the browser with no installation required. A needs analysis survey of 35 undergraduate students confirmed strong demand for real-time validation with explanatory feedback, with 49% of respondents selecting it as the single most important feature.</w:t>
-      </w:r>
-    </w:p>
-    <w:p>
-      <w:pPr>
-        <w:spacing w:after="120" w:line="228" w:lineRule="auto"/>
-        <w:ind w:firstLine="274"/>
-      </w:pPr>
-      <w:r>
-        <w:rPr>
-          <w:rFonts w:cs="Times New Roman"/>
-          <w:b/>
-          <w:bCs/>
-          <w:i/>
-          <w:iCs/>
-          <w:sz w:val="18"/>
-          <w:szCs w:val="18"/>
-        </w:rPr>
         <w:t>Keywords—arduino, circuit design, real-time validation, auto-wiring, web-based learning, electronics education, beginner feedback, rule-based engine</w:t>
       </w:r>
     </w:p>
@@ -471,19 +454,14 @@
           <w:rFonts w:cs="Times New Roman"/>
           <w:szCs w:val="20"/>
         </w:rPr>
-        <w:t xml:space="preserve">Web-based simulation tools such as Tinkercad Circuits [3] and Wokwi [4] can help by letting students prototype circuits before using physical hardware. Fritzing [5] provides a </w:t>
-      </w:r>
-    </w:p>
-    <w:p>
-      <w:pPr>
-        <w:spacing w:after="120" w:line="228" w:lineRule="auto"/>
-      </w:pPr>
+        <w:t xml:space="preserve">Web-based simulation tools such as Tinkercad Circuits [3] and Wokwi [4] can help by letting students prototype circuits before using physical hardware. Fritzing [5] provides a desktop-based breadboard layout tool for documentation and PCB design. More recently, Cirkit Designer [6] introduced AI-assisted circuit prototyping using large language models. </w:t>
+      </w:r>
       <w:r>
         <w:rPr>
           <w:rFonts w:cs="Times New Roman"/>
           <w:szCs w:val="20"/>
         </w:rPr>
-        <w:t>desktop-based breadboard layout tool for documentation and PCB design. More recently, Cirkit Designer [6] introduced AI-assisted circuit prototyping using large language models. These tools are useful, but they share one critical limitation: they are passive. The user builds the circuit manually, and errors only become visible when the simulation runs or when the physical circuit fails. None of them actively check for wiring problems during the design process, and none of them explain to the user why something is wrong or how to fix it.</w:t>
+        <w:t>These tools are useful, but they share one critical limitation: they are passive. The user builds the circuit manually, and errors only become visible when the simulation runs or when the physical circuit fails. None of them actively check for wiring problems during the design process, and none of them explain to the user why something is wrong or how to fix it.</w:t>
       </w:r>
     </w:p>
     <w:p>
@@ -587,15 +565,7 @@
           <w:rFonts w:cs="Times New Roman"/>
           <w:szCs w:val="20"/>
         </w:rPr>
-        <w:t xml:space="preserve">2. To design a rule-based validation engine (the Elera Validation Engine, or EVE) that detects nine categories of common electrical errors, including missing power and ground connections, current overload, duplicate pin assignments, </w:t>
-      </w:r>
-      <w:r>
-        <w:rPr>
-          <w:rFonts w:cs="Times New Roman"/>
-          <w:szCs w:val="20"/>
-        </w:rPr>
-        <w:lastRenderedPageBreak/>
-        <w:t>wrong I2C wiring, floating pins, and missing current-limiting resistors</w:t>
+        <w:t>2. To design a rule-based validation engine (the Elera Validation Engine, or EVE) that detects nine categories of common electrical errors, including missing power and ground connections, current overload, duplicate pin assignments, wrong I2C wiring, floating pins, and missing current-limiting resistors</w:t>
       </w:r>
       <w:r>
         <w:rPr>
@@ -615,6 +585,7 @@
           <w:rFonts w:cs="Times New Roman"/>
           <w:szCs w:val="20"/>
         </w:rPr>
+        <w:lastRenderedPageBreak/>
         <w:t>3. To design an auto-wiring engine that assigns the correct Arduino pins to component pins based on their electrical requirements (digital, analogue, PWM, I2C) and generates the wire connections automatically</w:t>
       </w:r>
       <w:r>
@@ -629,29 +600,17 @@
       <w:pPr>
         <w:spacing w:after="120" w:line="228" w:lineRule="auto"/>
         <w:ind w:firstLine="288"/>
-      </w:pPr>
-      <w:r>
         <w:rPr>
           <w:rFonts w:cs="Times New Roman"/>
           <w:szCs w:val="20"/>
         </w:rPr>
-        <w:t xml:space="preserve">4. To create a metadata-driven component library where each component's pin roles, current </w:t>
-      </w:r>
-      <w:proofErr w:type="gramStart"/>
+      </w:pPr>
       <w:r>
         <w:rPr>
           <w:rFonts w:cs="Times New Roman"/>
           <w:szCs w:val="20"/>
         </w:rPr>
-        <w:t>draw</w:t>
-      </w:r>
-      <w:proofErr w:type="gramEnd"/>
-      <w:r>
-        <w:rPr>
-          <w:rFonts w:cs="Times New Roman"/>
-          <w:szCs w:val="20"/>
-        </w:rPr>
-        <w:t>, and auto-wiring rules are stored as structured data, so the system can be extended with new components without modifying the core logic.</w:t>
+        <w:t>4. To create a metadata-driven component library where each component's pin roles, current draw, and auto-wiring rules are stored as structured data, so the system can be extended with new components without modifying the core logic.</w:t>
       </w:r>
     </w:p>
     <w:p>
@@ -664,7 +623,30 @@
           <w:rFonts w:cs="Times New Roman"/>
           <w:szCs w:val="20"/>
         </w:rPr>
-        <w:t>5. To design a component builder that allows users to import custom component images and use AI-assisted pin detection to define pin placements, signal types, and names, enabling the creation of user-defined components that integrate with the validation and auto-wiring engines.</w:t>
+        <w:t>5.</w:t>
+      </w:r>
+      <w:r>
+        <w:t xml:space="preserve"> </w:t>
+      </w:r>
+      <w:r>
+        <w:rPr>
+          <w:rFonts w:cs="Times New Roman"/>
+          <w:szCs w:val="20"/>
+        </w:rPr>
+        <w:t>To integrate a generative AI assistant, utilizing a "Bring Your Own Key" (BYOK) model, capable of providing autonomous circuit-building guidance and manipulating the canvas using natural language prompts.</w:t>
+      </w:r>
+    </w:p>
+    <w:p>
+      <w:pPr>
+        <w:spacing w:after="120" w:line="228" w:lineRule="auto"/>
+        <w:ind w:firstLine="288"/>
+      </w:pPr>
+      <w:r>
+        <w:rPr>
+          <w:rFonts w:cs="Times New Roman"/>
+          <w:szCs w:val="20"/>
+        </w:rPr>
+        <w:t>6. To design a component builder that allows users to import custom component images and use AI-assisted pin detection to define pin placements, signal types, and names, enabling the creation of user-defined components that integrate with the validation and auto-wiring engines.</w:t>
       </w:r>
     </w:p>
     <w:p>
@@ -687,19 +669,27 @@
       <w:pPr>
         <w:spacing w:after="120" w:line="228" w:lineRule="auto"/>
         <w:ind w:firstLine="288"/>
-      </w:pPr>
-      <w:r>
         <w:rPr>
           <w:rFonts w:cs="Times New Roman"/>
           <w:szCs w:val="20"/>
         </w:rPr>
-        <w:t>Elera is a web-based application with a primary focus on the Arduino Uno as the target board for beginner-level circuit education. The architecture supports extension to additional boards in future iterations. The system is designed to include: a component library with 14 beginner-level parts, a visual canvas with drag-and-drop placement and pin-to-pin wiring, a validation engine covering nine rule categories, an auto-wiring engine that assigns pins based on type, an AI assistant powered by the Google Gemini API, a component builder for user-defined parts, and user authentication with cloud-based project storage via Supabase. Full circuit simulation, running Arduino code, and PCB design are outside the current scope.</w:t>
+      </w:pPr>
+      <w:r>
+        <w:rPr>
+          <w:rFonts w:cs="Times New Roman"/>
+          <w:szCs w:val="20"/>
+        </w:rPr>
+        <w:t>The system is designed to include: a component library with 14 beginner-level parts, a visual canvas with drag-and-drop placement and pin-to-pin wiring, a validation engine covering nine rule categories, and an auto-wiring engine that assigns pins based on type. Crucially, the system features an integrated AI assistant capable of autonomously building and modifying circuits using the same canvas tools available to the human user. This AI operates on a "Bring Your Own Key" (BYOK) model, allowing users to plug in their own API keys (e.g., Google Gemini) to access the assistant. User authentication and cloud-based project storage are handled via Supabase. Full circuit simulation, running Arduino code, and PCB design are outside the current scope.</w:t>
       </w:r>
     </w:p>
     <w:p>
       <w:pPr>
         <w:spacing w:after="120" w:line="228" w:lineRule="auto"/>
         <w:ind w:firstLine="288"/>
+        <w:rPr>
+          <w:rFonts w:cs="Times New Roman"/>
+          <w:szCs w:val="20"/>
+        </w:rPr>
       </w:pPr>
       <w:r>
         <w:rPr>
@@ -751,20 +741,7 @@
           <w:rFonts w:cs="Times New Roman"/>
           <w:szCs w:val="20"/>
         </w:rPr>
-        <w:t>Elera runs in the browser and uses Supabase as its backend for project persistence and user authentication. The development environment consists of Windows 10/11, Node.js 18+, Vite 6.0, Lit 3.2 (Web Components), @wokwi/elements 1.9.2, JavaScript (ES Modules), and Supabase (hosted PostgreSQL, authentication, REST API). The user-facing environment requires any modern browser (Chrome, Firefox, Edge), no installation or plugins, and a minimum screen resolution of 1280 x 720. UI prototyping was carried out using Figma.</w:t>
-      </w:r>
-    </w:p>
-    <w:p>
-      <w:pPr>
-        <w:spacing w:after="120" w:line="228" w:lineRule="auto"/>
-        <w:ind w:firstLine="288"/>
-      </w:pPr>
-      <w:r>
-        <w:rPr>
-          <w:rFonts w:cs="Times New Roman"/>
-          <w:szCs w:val="20"/>
-        </w:rPr>
-        <w:t>The rest of this paper is organised as follows. Section II reviews existing circuit design tools and identifies their limitations. Section III describes the system design and methodology for the pre-production phase.</w:t>
+        <w:t>Elera runs in the browser and uses Supabase as its backend for project persistence and user authentication. The development environment consists of Windows 10/11, Node.js 18+, Vite 6.0, Lit 3.2 (Web Components), @wokwi/elements 1.9.2, JavaScript (ES Modules), and Supabase (hosted PostgreSQL, authentication, REST API). The user-facing environment requires any modern browser (Chrome, Firefox, Edge), no installation or plugins, and a minimum screen resolution of 1280 x 720.</w:t>
       </w:r>
     </w:p>
     <w:p>
@@ -808,14 +785,14 @@
           <w:rFonts w:cs="Times New Roman"/>
           <w:szCs w:val="20"/>
         </w:rPr>
-        <w:t xml:space="preserve">Learning electronics through hands-on prototyping places a heavy cognitive demand on students. When working with Arduino circuits, learners must simultaneously manage </w:t>
+        <w:t xml:space="preserve">Learning electronics through hands-on prototyping places a heavy cognitive demand on students. When working with Arduino circuits, learners must simultaneously manage programming syntax, the pin layout of the microcontroller, </w:t>
       </w:r>
       <w:r>
         <w:rPr>
           <w:rFonts w:cs="Times New Roman"/>
           <w:szCs w:val="20"/>
         </w:rPr>
-        <w:t>programming syntax, the pin layout of the microcontroller, component datasheets, and the physical routing of wires on a breadboard or virtual canvas. Cognitive load theory suggests that when the total demand on a learner's working memory exceeds its capacity, learning becomes less effective and errors increase [7]. In a circuit design context, this overload often manifests as wiring mistakes that students do not notice until the circuit fails, at which point tracing the root cause is difficult.</w:t>
+        <w:t>component datasheets, and the physical routing of wires on a breadboard or virtual canvas. Cognitive load theory suggests that when the total demand on a learner's working memory exceeds its capacity, learning becomes less effective and errors increase [7]. In a circuit design context, this overload often manifests as wiring mistakes that students do not notice until the circuit fails, at which point tracing the root cause is difficult.</w:t>
       </w:r>
     </w:p>
     <w:p>
@@ -896,7 +873,7 @@
           <w:rFonts w:cs="Times New Roman"/>
           <w:szCs w:val="20"/>
         </w:rPr>
-        <w:t xml:space="preserve">Fritzing started in 2007 at the University of Applied Sciences Potsdam as an open-source tool for documenting electronic prototypes [5]. It offers three views: a photorealistic </w:t>
+        <w:t xml:space="preserve">Fritzing started in 2007 at the University of Applied Sciences Potsdam as an open-source tool for documenting electronic prototypes [5]. It offers three views: a photorealistic Breadboard View, a Schematics View, and a PCB View that </w:t>
       </w:r>
       <w:r>
         <w:rPr>
@@ -904,7 +881,7 @@
           <w:szCs w:val="20"/>
         </w:rPr>
         <w:lastRenderedPageBreak/>
-        <w:t>Breadboard View, a Schematics View, and a PCB View that generates Gerber manufacturing files. Fritzing is widely used in academic settings, but it cannot simulate circuits at all. It does not run code, does not show voltage or current, and has no validation of any kind [12]. Users must build and test their circuits elsewhere.</w:t>
+        <w:t>generates Gerber manufacturing files. Fritzing is widely used in academic settings, but it cannot simulate circuits at all. It does not run code, does not show voltage or current, and has no validation of any kind [12]. Users must build and test their circuits elsewhere.</w:t>
       </w:r>
     </w:p>
     <w:p>
@@ -925,12 +902,28 @@
         <w:spacing w:after="120" w:line="228" w:lineRule="auto"/>
         <w:ind w:firstLine="288"/>
       </w:pPr>
+      <w:proofErr w:type="spellStart"/>
       <w:r>
         <w:rPr>
           <w:rFonts w:cs="Times New Roman"/>
           <w:szCs w:val="20"/>
         </w:rPr>
-        <w:t>Cirkit Designer was created by Austin Small, a former Google engineer, to address the gap between wiring guidance and code generation [6]. The platform combines a component library of over 30,000 parts with an AI assistant powered by large language models. A user can describe a project in plain English and receive component suggestions, wiring instructions, and Arduino code. The AI assistant, however, relies on probabilistic language models and can produce incorrect recommendations [6]. The AI also only provides text-based wiring instructions. It does not draw wires on the canvas, so the manual effort remains.</w:t>
+        <w:t>Cirkit</w:t>
+      </w:r>
+      <w:proofErr w:type="spellEnd"/>
+      <w:r>
+        <w:rPr>
+          <w:rFonts w:cs="Times New Roman"/>
+          <w:szCs w:val="20"/>
+        </w:rPr>
+        <w:t xml:space="preserve"> Designer was created by Austin Small, a former Google engineer, to address the gap between manual wiring and code generation [6]. The platform combines a massive component library with a generative AI assistant that can automatically route wires and write C++ code from plain-English prompts. However, relying on probabilistic large language models for circuit logic presents a pedagogical risk, as the AI bypasses the manual learning process and can hallucinate incorrect connections [6]. Furthermore, placing these advanced routing features behind a premium paywall creates strict accessibility barriers for university adoption</w:t>
+      </w:r>
+      <w:r>
+        <w:rPr>
+          <w:rFonts w:cs="Times New Roman"/>
+          <w:szCs w:val="20"/>
+        </w:rPr>
+        <w:t>.</w:t>
       </w:r>
     </w:p>
     <w:p>
@@ -979,130 +972,343 @@
           <w:rFonts w:cs="Times New Roman"/>
           <w:szCs w:val="20"/>
         </w:rPr>
-        <w:t xml:space="preserve"> in Table I.</w:t>
+        <w:t xml:space="preserve"> in Table </w:t>
+      </w:r>
+      <w:r>
+        <w:rPr>
+          <w:rFonts w:cs="Times New Roman"/>
+          <w:szCs w:val="20"/>
+        </w:rPr>
+        <w:t>1</w:t>
+      </w:r>
+      <w:r>
+        <w:rPr>
+          <w:rFonts w:cs="Times New Roman"/>
+          <w:szCs w:val="20"/>
+        </w:rPr>
+        <w:t>.</w:t>
       </w:r>
     </w:p>
     <w:p>
       <w:pPr>
-        <w:spacing w:after="120" w:line="228" w:lineRule="auto"/>
-      </w:pPr>
-      <w:r>
+        <w:spacing w:after="160" w:line="240" w:lineRule="auto"/>
         <w:rPr>
           <w:rFonts w:cs="Times New Roman"/>
           <w:szCs w:val="20"/>
         </w:rPr>
-        <w:t>The comparison reveals five gaps that are consistent across all existing tools. First, real-time validation is absent everywhere. All four tools either show errors only after simulation or do not validate at all. Second, automated pin-to-pin wiring does not exist. Every tool requires manual wire routing. Third, educational feedback is either missing or limited to generic error messages. Fourth, components are treated as static graphics without structured metadata about their electrical properties. Without metadata, automatic validation and wiring are not feasible. Fifth, based on hands-on evaluation conducted during this project, the wiring experience across all four tools lacks usability support. Wires become cluttered and overlapping as circuits grow, and none of the tools offer automatic wire cleanup or re-routing. Students must spend time managing wire layout manually, which adds to the overall cognitive burden.</w:t>
+      </w:pPr>
+      <w:r>
+        <w:rPr>
+          <w:rFonts w:cs="Times New Roman"/>
+          <w:szCs w:val="20"/>
+        </w:rPr>
+        <w:tab/>
+      </w:r>
+      <w:r>
+        <w:rPr>
+          <w:rFonts w:cs="Times New Roman"/>
+          <w:szCs w:val="20"/>
+        </w:rPr>
+        <w:t xml:space="preserve">The comparison reveals five critical gaps when evaluating these tools for undergraduate education. First, real-time, deterministic validation is absent; existing tools either show </w:t>
+      </w:r>
+      <w:r>
+        <w:rPr>
+          <w:rFonts w:cs="Times New Roman"/>
+          <w:szCs w:val="20"/>
+        </w:rPr>
+        <w:t xml:space="preserve">errors only after simulation, rely on probabilistic AI guessing, or do not validate at all. Second, while commercial tools like </w:t>
+      </w:r>
+      <w:proofErr w:type="spellStart"/>
+      <w:r>
+        <w:rPr>
+          <w:rFonts w:cs="Times New Roman"/>
+          <w:szCs w:val="20"/>
+        </w:rPr>
+        <w:t>Cirkit</w:t>
+      </w:r>
+      <w:proofErr w:type="spellEnd"/>
+      <w:r>
+        <w:rPr>
+          <w:rFonts w:cs="Times New Roman"/>
+          <w:szCs w:val="20"/>
+        </w:rPr>
+        <w:t xml:space="preserve"> Designer offer generative auto-wiring and dynamic wire cleanup, they utilize AI to bypass the student's manual design process rather than assisting it with strict electrical rules. Third, educational feedback is either missing entirely, limited to generic compiler errors, or hidden behind premium paywalls. Fourth, most tools treat components as static graphics without structured metadata about their electrical properties, making deterministic rule-checking impossible. Fifth, there is a lack of accessible, completely free platforms that combine visual circuit building, automated routing, and deterministic error explanations in one cohesive environment tailored for academia.</w:t>
       </w:r>
     </w:p>
     <w:p>
       <w:pPr>
-        <w:spacing w:after="120" w:line="228" w:lineRule="auto"/>
-        <w:ind w:firstLine="288"/>
+        <w:spacing w:after="160" w:line="240" w:lineRule="auto"/>
         <w:rPr>
           <w:rFonts w:cs="Times New Roman"/>
           <w:szCs w:val="20"/>
         </w:rPr>
+        <w:sectPr>
+          <w:type w:val="continuous"/>
+          <w:pgSz w:w="12240" w:h="15840"/>
+          <w:pgMar w:top="1080" w:right="893" w:bottom="1440" w:left="893" w:header="720" w:footer="720" w:gutter="0"/>
+          <w:cols w:num="2" w:space="360"/>
+          <w:docGrid w:linePitch="360"/>
+        </w:sectPr>
       </w:pPr>
       <w:r>
         <w:rPr>
           <w:rFonts w:cs="Times New Roman"/>
           <w:szCs w:val="20"/>
         </w:rPr>
-        <w:t xml:space="preserve">Elera adapts the strengths of each reviewed platform while addressing their shared weaknesses. From Tinkercad, Elera adopts the browser-based, drag-and-drop approach that makes circuit building accessible to beginners. From Fritzing, the concept of realistic visual component rendering is retained through the @wokwi/elements library. From Wokwi, the idea of a web-first platform with no installation requirement is carried forward. From Cirkit Designer, the use of AI-assisted guidance is adapted, but Elera supplements this with a </w:t>
+        <w:tab/>
       </w:r>
       <w:r>
         <w:rPr>
           <w:rFonts w:cs="Times New Roman"/>
           <w:szCs w:val="20"/>
         </w:rPr>
-        <w:t>deterministic, rule-based validation engine that produces consistent and predictable feedback. The key differentiation is that Elera adds four features that none of the reviewed platforms currently offer: real-time validation during the design phase, automated pin-to-pin wiring based on structured component metadata, plain-language educational feedback that explains both the problem and the fix, and automatic wire cleanup that re-routes overlapping or tangled wires with a single action.</w:t>
+        <w:t xml:space="preserve">Elera adapts the strengths of each reviewed platform while addressing their shared weaknesses in a pedagogical context. From </w:t>
+      </w:r>
+      <w:proofErr w:type="spellStart"/>
+      <w:r>
+        <w:rPr>
+          <w:rFonts w:cs="Times New Roman"/>
+          <w:szCs w:val="20"/>
+        </w:rPr>
+        <w:t>Tinkercad</w:t>
+      </w:r>
+      <w:proofErr w:type="spellEnd"/>
+      <w:r>
+        <w:rPr>
+          <w:rFonts w:cs="Times New Roman"/>
+          <w:szCs w:val="20"/>
+        </w:rPr>
+        <w:t xml:space="preserve">, Elera adopts the browser-based, drag-and-drop approach that makes circuit building accessible to beginners. From Fritzing, the concept of realistic visual component rendering is retained through </w:t>
+      </w:r>
+      <w:proofErr w:type="gramStart"/>
+      <w:r>
+        <w:rPr>
+          <w:rFonts w:cs="Times New Roman"/>
+          <w:szCs w:val="20"/>
+        </w:rPr>
+        <w:t>the @</w:t>
+      </w:r>
+      <w:proofErr w:type="gramEnd"/>
+      <w:r>
+        <w:rPr>
+          <w:rFonts w:cs="Times New Roman"/>
+          <w:szCs w:val="20"/>
+        </w:rPr>
+        <w:t xml:space="preserve">wokwi/elements library. From </w:t>
+      </w:r>
+      <w:proofErr w:type="spellStart"/>
+      <w:r>
+        <w:rPr>
+          <w:rFonts w:cs="Times New Roman"/>
+          <w:szCs w:val="20"/>
+        </w:rPr>
+        <w:t>Wokwi</w:t>
+      </w:r>
+      <w:proofErr w:type="spellEnd"/>
+      <w:r>
+        <w:rPr>
+          <w:rFonts w:cs="Times New Roman"/>
+          <w:szCs w:val="20"/>
+        </w:rPr>
+        <w:t xml:space="preserve">, the idea of a web-first platform with no installation requirement is carried forward. From </w:t>
+      </w:r>
+      <w:proofErr w:type="spellStart"/>
+      <w:r>
+        <w:rPr>
+          <w:rFonts w:cs="Times New Roman"/>
+          <w:szCs w:val="20"/>
+        </w:rPr>
+        <w:t>Cirkit</w:t>
+      </w:r>
+      <w:proofErr w:type="spellEnd"/>
+      <w:r>
+        <w:rPr>
+          <w:rFonts w:cs="Times New Roman"/>
+          <w:szCs w:val="20"/>
+        </w:rPr>
+        <w:t xml:space="preserve"> Designer, the concepts of AI-assisted guidance and dynamic layout cleanup are adapted. However, Elera replaces the generative AI approach with a deterministic, metadata-driven architecture. Instead of allowing a probabilistic language model to guess </w:t>
+      </w:r>
+      <w:proofErr w:type="gramStart"/>
+      <w:r>
+        <w:rPr>
+          <w:rFonts w:cs="Times New Roman"/>
+          <w:szCs w:val="20"/>
+        </w:rPr>
+        <w:t>the electrical</w:t>
+      </w:r>
+      <w:proofErr w:type="gramEnd"/>
+      <w:r>
+        <w:rPr>
+          <w:rFonts w:cs="Times New Roman"/>
+          <w:szCs w:val="20"/>
+        </w:rPr>
+        <w:t xml:space="preserve"> physics, Elera uses model-agnostic function calling purely to interpret user intent. The actual execution of auto-wiring and orthogonal routing is strictly governed by Elera’s internal rule-based validation engine (EVE). The key differentiation is that Elera delivers real-time deterministic validation, metadata-driven automated wiring, and plain-language educational feedback within a completely free, client-side environment.</w:t>
+      </w:r>
+    </w:p>
+    <w:p>
+      <w:pPr>
+        <w:pStyle w:val="Caption"/>
+        <w:keepNext/>
+        <w:jc w:val="center"/>
+        <w:rPr>
+          <w:color w:val="000000" w:themeColor="text1"/>
+        </w:rPr>
+      </w:pPr>
+      <w:r>
+        <w:rPr>
+          <w:color w:val="000000" w:themeColor="text1"/>
+        </w:rPr>
+        <w:t xml:space="preserve">TABLE </w:t>
+      </w:r>
+      <w:r>
+        <w:rPr>
+          <w:color w:val="000000" w:themeColor="text1"/>
+        </w:rPr>
+        <w:fldChar w:fldCharType="begin"/>
+      </w:r>
+      <w:r>
+        <w:rPr>
+          <w:color w:val="000000" w:themeColor="text1"/>
+        </w:rPr>
+        <w:instrText xml:space="preserve"> SEQ Table \* ARABIC </w:instrText>
+      </w:r>
+      <w:r>
+        <w:rPr>
+          <w:color w:val="000000" w:themeColor="text1"/>
+        </w:rPr>
+        <w:fldChar w:fldCharType="separate"/>
+      </w:r>
+      <w:r>
+        <w:rPr>
+          <w:noProof/>
+          <w:color w:val="000000" w:themeColor="text1"/>
+        </w:rPr>
+        <w:t>1</w:t>
+      </w:r>
+      <w:r>
+        <w:rPr>
+          <w:color w:val="000000" w:themeColor="text1"/>
+        </w:rPr>
+        <w:fldChar w:fldCharType="end"/>
+      </w:r>
+      <w:r>
+        <w:rPr>
+          <w:color w:val="000000" w:themeColor="text1"/>
+        </w:rPr>
+        <w:t xml:space="preserve">: </w:t>
+      </w:r>
+      <w:r>
+        <w:rPr>
+          <w:color w:val="000000" w:themeColor="text1"/>
+        </w:rPr>
+        <w:t>COMPARISON OF CIRCUIT DESIGN PLATFORMS</w:t>
+      </w:r>
+      <w:r>
+        <w:rPr>
+          <w:color w:val="000000" w:themeColor="text1"/>
+        </w:rPr>
+        <w:t xml:space="preserve"> </w:t>
       </w:r>
     </w:p>
     <w:tbl>
       <w:tblPr>
         <w:tblStyle w:val="TableGrid"/>
-        <w:tblW w:w="5000" w:type="pct"/>
-        <w:tblLayout w:type="fixed"/>
+        <w:tblW w:w="0" w:type="auto"/>
+        <w:jc w:val="center"/>
         <w:tblLook w:val="04A0" w:firstRow="1" w:lastRow="0" w:firstColumn="1" w:lastColumn="0" w:noHBand="0" w:noVBand="1"/>
       </w:tblPr>
       <w:tblGrid>
-        <w:gridCol w:w="831"/>
-        <w:gridCol w:w="792"/>
-        <w:gridCol w:w="792"/>
-        <w:gridCol w:w="989"/>
+        <w:gridCol w:w="1101"/>
+        <w:gridCol w:w="928"/>
         <w:gridCol w:w="910"/>
-        <w:gridCol w:w="949"/>
+        <w:gridCol w:w="919"/>
+        <w:gridCol w:w="1763"/>
+        <w:gridCol w:w="2532"/>
       </w:tblGrid>
       <w:tr>
         <w:trPr>
-          <w:trHeight w:val="340"/>
+          <w:trHeight w:val="373"/>
+          <w:jc w:val="center"/>
         </w:trPr>
         <w:tc>
           <w:tcPr>
-            <w:tcW w:w="1465" w:type="dxa"/>
+            <w:tcW w:w="1101" w:type="dxa"/>
+            <w:hideMark/>
           </w:tcPr>
           <w:p>
             <w:pPr>
-              <w:jc w:val="center"/>
+              <w:spacing w:after="160" w:line="278" w:lineRule="auto"/>
               <w:rPr>
-                <w:sz w:val="18"/>
-                <w:szCs w:val="18"/>
+                <w:rFonts w:asciiTheme="majorBidi" w:hAnsiTheme="majorBidi" w:cstheme="majorBidi"/>
+                <w:b/>
+                <w:bCs/>
+                <w:sz w:val="16"/>
+                <w:szCs w:val="16"/>
               </w:rPr>
             </w:pPr>
             <w:r>
               <w:rPr>
+                <w:rFonts w:asciiTheme="majorBidi" w:hAnsiTheme="majorBidi" w:cstheme="majorBidi"/>
                 <w:b/>
                 <w:bCs/>
-                <w:sz w:val="18"/>
-                <w:szCs w:val="18"/>
+                <w:sz w:val="16"/>
+                <w:szCs w:val="16"/>
               </w:rPr>
-              <w:t>1</w:t>
+              <w:t>Feature / Capability</w:t>
             </w:r>
           </w:p>
         </w:tc>
         <w:tc>
           <w:tcPr>
-            <w:tcW w:w="1384" w:type="dxa"/>
+            <w:tcW w:w="649" w:type="dxa"/>
+            <w:hideMark/>
           </w:tcPr>
           <w:p>
             <w:pPr>
-              <w:jc w:val="center"/>
+              <w:spacing w:after="160" w:line="278" w:lineRule="auto"/>
               <w:rPr>
-                <w:sz w:val="18"/>
-                <w:szCs w:val="18"/>
+                <w:rFonts w:asciiTheme="majorBidi" w:hAnsiTheme="majorBidi" w:cstheme="majorBidi"/>
+                <w:b/>
+                <w:bCs/>
+                <w:sz w:val="16"/>
+                <w:szCs w:val="16"/>
               </w:rPr>
             </w:pPr>
-            <w:proofErr w:type="spellStart"/>
             <w:r>
               <w:rPr>
+                <w:rFonts w:asciiTheme="majorBidi" w:hAnsiTheme="majorBidi" w:cstheme="majorBidi"/>
                 <w:b/>
                 <w:bCs/>
-                <w:sz w:val="18"/>
-                <w:szCs w:val="18"/>
+                <w:sz w:val="16"/>
+                <w:szCs w:val="16"/>
               </w:rPr>
               <w:t>Tinkercad</w:t>
             </w:r>
-            <w:proofErr w:type="spellEnd"/>
           </w:p>
         </w:tc>
         <w:tc>
           <w:tcPr>
-            <w:tcW w:w="1384" w:type="dxa"/>
+            <w:tcW w:w="0" w:type="auto"/>
+            <w:hideMark/>
           </w:tcPr>
           <w:p>
             <w:pPr>
-              <w:jc w:val="center"/>
+              <w:spacing w:after="160" w:line="278" w:lineRule="auto"/>
               <w:rPr>
-                <w:sz w:val="18"/>
-                <w:szCs w:val="18"/>
+                <w:rFonts w:asciiTheme="majorBidi" w:hAnsiTheme="majorBidi" w:cstheme="majorBidi"/>
+                <w:b/>
+                <w:bCs/>
+                <w:sz w:val="16"/>
+                <w:szCs w:val="16"/>
               </w:rPr>
             </w:pPr>
             <w:r>
               <w:rPr>
+                <w:rFonts w:asciiTheme="majorBidi" w:hAnsiTheme="majorBidi" w:cstheme="majorBidi"/>
                 <w:b/>
                 <w:bCs/>
-                <w:sz w:val="18"/>
-                <w:szCs w:val="18"/>
+                <w:sz w:val="16"/>
+                <w:szCs w:val="16"/>
               </w:rPr>
               <w:t>Fritzing</w:t>
             </w:r>
@@ -1110,532 +1316,757 @@
         </w:tc>
         <w:tc>
           <w:tcPr>
-            <w:tcW w:w="1791" w:type="dxa"/>
+            <w:tcW w:w="0" w:type="auto"/>
+            <w:hideMark/>
           </w:tcPr>
           <w:p>
             <w:pPr>
-              <w:jc w:val="center"/>
+              <w:spacing w:after="160" w:line="278" w:lineRule="auto"/>
               <w:rPr>
-                <w:sz w:val="18"/>
-                <w:szCs w:val="18"/>
+                <w:rFonts w:asciiTheme="majorBidi" w:hAnsiTheme="majorBidi" w:cstheme="majorBidi"/>
+                <w:b/>
+                <w:bCs/>
+                <w:sz w:val="16"/>
+                <w:szCs w:val="16"/>
               </w:rPr>
             </w:pPr>
-            <w:proofErr w:type="spellStart"/>
             <w:r>
               <w:rPr>
+                <w:rFonts w:asciiTheme="majorBidi" w:hAnsiTheme="majorBidi" w:cstheme="majorBidi"/>
                 <w:b/>
                 <w:bCs/>
-                <w:sz w:val="18"/>
-                <w:szCs w:val="18"/>
+                <w:sz w:val="16"/>
+                <w:szCs w:val="16"/>
               </w:rPr>
               <w:t>Wokwi</w:t>
-            </w:r>
-            <w:proofErr w:type="spellEnd"/>
-          </w:p>
-        </w:tc>
-        <w:tc>
-          <w:tcPr>
-            <w:tcW w:w="1628" w:type="dxa"/>
-          </w:tcPr>
-          <w:p>
-            <w:pPr>
-              <w:jc w:val="center"/>
-              <w:rPr>
-                <w:sz w:val="18"/>
-                <w:szCs w:val="18"/>
-              </w:rPr>
-            </w:pPr>
-            <w:proofErr w:type="spellStart"/>
-            <w:r>
-              <w:rPr>
-                <w:b/>
-                <w:bCs/>
-                <w:sz w:val="18"/>
-                <w:szCs w:val="18"/>
-              </w:rPr>
-              <w:t>Cirkit</w:t>
-            </w:r>
-            <w:proofErr w:type="spellEnd"/>
-            <w:r>
-              <w:rPr>
-                <w:b/>
-                <w:bCs/>
-                <w:sz w:val="18"/>
-                <w:szCs w:val="18"/>
-              </w:rPr>
-              <w:t xml:space="preserve"> Designer</w:t>
             </w:r>
           </w:p>
         </w:tc>
         <w:tc>
           <w:tcPr>
-            <w:tcW w:w="1708" w:type="dxa"/>
+            <w:tcW w:w="0" w:type="auto"/>
+            <w:hideMark/>
           </w:tcPr>
           <w:p>
             <w:pPr>
-              <w:jc w:val="center"/>
+              <w:spacing w:after="160" w:line="278" w:lineRule="auto"/>
               <w:rPr>
-                <w:sz w:val="18"/>
-                <w:szCs w:val="18"/>
+                <w:rFonts w:asciiTheme="majorBidi" w:hAnsiTheme="majorBidi" w:cstheme="majorBidi"/>
+                <w:b/>
+                <w:bCs/>
+                <w:sz w:val="16"/>
+                <w:szCs w:val="16"/>
               </w:rPr>
             </w:pPr>
             <w:r>
               <w:rPr>
+                <w:rFonts w:asciiTheme="majorBidi" w:hAnsiTheme="majorBidi" w:cstheme="majorBidi"/>
                 <w:b/>
                 <w:bCs/>
-                <w:sz w:val="18"/>
-                <w:szCs w:val="18"/>
+                <w:sz w:val="16"/>
+                <w:szCs w:val="16"/>
               </w:rPr>
-              <w:t>Elera</w:t>
+              <w:t>Cirkit Designer</w:t>
+            </w:r>
+          </w:p>
+        </w:tc>
+        <w:tc>
+          <w:tcPr>
+            <w:tcW w:w="0" w:type="auto"/>
+            <w:hideMark/>
+          </w:tcPr>
+          <w:p>
+            <w:pPr>
+              <w:spacing w:after="160" w:line="278" w:lineRule="auto"/>
+              <w:rPr>
+                <w:rFonts w:asciiTheme="majorBidi" w:hAnsiTheme="majorBidi" w:cstheme="majorBidi"/>
+                <w:b/>
+                <w:bCs/>
+                <w:sz w:val="16"/>
+                <w:szCs w:val="16"/>
+              </w:rPr>
+            </w:pPr>
+            <w:r>
+              <w:rPr>
+                <w:rFonts w:asciiTheme="majorBidi" w:hAnsiTheme="majorBidi" w:cstheme="majorBidi"/>
+                <w:b/>
+                <w:bCs/>
+                <w:sz w:val="16"/>
+                <w:szCs w:val="16"/>
+              </w:rPr>
+              <w:t>Elera (Proposed)</w:t>
             </w:r>
           </w:p>
         </w:tc>
       </w:tr>
       <w:tr>
         <w:trPr>
-          <w:trHeight w:val="340"/>
+          <w:trHeight w:val="373"/>
+          <w:jc w:val="center"/>
         </w:trPr>
         <w:tc>
           <w:tcPr>
-            <w:tcW w:w="1465" w:type="dxa"/>
+            <w:tcW w:w="1101" w:type="dxa"/>
+            <w:hideMark/>
           </w:tcPr>
           <w:p>
             <w:pPr>
+              <w:spacing w:after="160" w:line="278" w:lineRule="auto"/>
               <w:rPr>
-                <w:sz w:val="18"/>
-                <w:szCs w:val="18"/>
+                <w:rFonts w:asciiTheme="majorBidi" w:hAnsiTheme="majorBidi" w:cstheme="majorBidi"/>
+                <w:b/>
+                <w:bCs/>
+                <w:sz w:val="16"/>
+                <w:szCs w:val="16"/>
               </w:rPr>
             </w:pPr>
             <w:r>
               <w:rPr>
-                <w:sz w:val="18"/>
-                <w:szCs w:val="18"/>
+                <w:rFonts w:asciiTheme="majorBidi" w:hAnsiTheme="majorBidi" w:cstheme="majorBidi"/>
+                <w:b/>
+                <w:bCs/>
+                <w:sz w:val="16"/>
+                <w:szCs w:val="16"/>
               </w:rPr>
-              <w:t>Primary Focus</w:t>
+              <w:t>Primary Phase</w:t>
             </w:r>
           </w:p>
         </w:tc>
         <w:tc>
           <w:tcPr>
-            <w:tcW w:w="1384" w:type="dxa"/>
+            <w:tcW w:w="649" w:type="dxa"/>
+            <w:hideMark/>
           </w:tcPr>
           <w:p>
             <w:pPr>
+              <w:spacing w:after="160" w:line="278" w:lineRule="auto"/>
               <w:rPr>
-                <w:sz w:val="18"/>
-                <w:szCs w:val="18"/>
+                <w:rFonts w:asciiTheme="majorBidi" w:hAnsiTheme="majorBidi" w:cstheme="majorBidi"/>
+                <w:sz w:val="16"/>
+                <w:szCs w:val="16"/>
               </w:rPr>
             </w:pPr>
             <w:r>
               <w:rPr>
-                <w:sz w:val="18"/>
-                <w:szCs w:val="18"/>
+                <w:rFonts w:asciiTheme="majorBidi" w:hAnsiTheme="majorBidi" w:cstheme="majorBidi"/>
+                <w:sz w:val="16"/>
+                <w:szCs w:val="16"/>
               </w:rPr>
-              <w:t>Beginner education</w:t>
+              <w:t>Simulation</w:t>
             </w:r>
           </w:p>
         </w:tc>
         <w:tc>
           <w:tcPr>
-            <w:tcW w:w="1384" w:type="dxa"/>
+            <w:tcW w:w="0" w:type="auto"/>
+            <w:hideMark/>
           </w:tcPr>
           <w:p>
             <w:pPr>
+              <w:spacing w:after="160" w:line="278" w:lineRule="auto"/>
               <w:rPr>
-                <w:sz w:val="18"/>
-                <w:szCs w:val="18"/>
+                <w:rFonts w:asciiTheme="majorBidi" w:hAnsiTheme="majorBidi" w:cstheme="majorBidi"/>
+                <w:sz w:val="16"/>
+                <w:szCs w:val="16"/>
               </w:rPr>
             </w:pPr>
             <w:r>
               <w:rPr>
-                <w:sz w:val="18"/>
-                <w:szCs w:val="18"/>
+                <w:rFonts w:asciiTheme="majorBidi" w:hAnsiTheme="majorBidi" w:cstheme="majorBidi"/>
+                <w:sz w:val="16"/>
+                <w:szCs w:val="16"/>
               </w:rPr>
-              <w:t>Documentation, PCB</w:t>
+              <w:t>Doc / PCB</w:t>
             </w:r>
           </w:p>
         </w:tc>
         <w:tc>
           <w:tcPr>
-            <w:tcW w:w="1791" w:type="dxa"/>
+            <w:tcW w:w="0" w:type="auto"/>
+            <w:hideMark/>
           </w:tcPr>
           <w:p>
             <w:pPr>
+              <w:spacing w:after="160" w:line="278" w:lineRule="auto"/>
               <w:rPr>
-                <w:sz w:val="18"/>
-                <w:szCs w:val="18"/>
+                <w:rFonts w:asciiTheme="majorBidi" w:hAnsiTheme="majorBidi" w:cstheme="majorBidi"/>
+                <w:sz w:val="16"/>
+                <w:szCs w:val="16"/>
               </w:rPr>
             </w:pPr>
             <w:r>
               <w:rPr>
-                <w:sz w:val="18"/>
-                <w:szCs w:val="18"/>
+                <w:rFonts w:asciiTheme="majorBidi" w:hAnsiTheme="majorBidi" w:cstheme="majorBidi"/>
+                <w:sz w:val="16"/>
+                <w:szCs w:val="16"/>
               </w:rPr>
-              <w:t>Advanced IoT simulation</w:t>
+              <w:t>Simulation</w:t>
             </w:r>
           </w:p>
         </w:tc>
         <w:tc>
           <w:tcPr>
-            <w:tcW w:w="1628" w:type="dxa"/>
+            <w:tcW w:w="0" w:type="auto"/>
+            <w:hideMark/>
           </w:tcPr>
           <w:p>
             <w:pPr>
+              <w:spacing w:after="160" w:line="278" w:lineRule="auto"/>
               <w:rPr>
-                <w:sz w:val="18"/>
-                <w:szCs w:val="18"/>
+                <w:rFonts w:asciiTheme="majorBidi" w:hAnsiTheme="majorBidi" w:cstheme="majorBidi"/>
+                <w:sz w:val="16"/>
+                <w:szCs w:val="16"/>
               </w:rPr>
             </w:pPr>
             <w:r>
               <w:rPr>
-                <w:sz w:val="18"/>
-                <w:szCs w:val="18"/>
+                <w:rFonts w:asciiTheme="majorBidi" w:hAnsiTheme="majorBidi" w:cstheme="majorBidi"/>
+                <w:sz w:val="16"/>
+                <w:szCs w:val="16"/>
               </w:rPr>
-              <w:t>AI-assisted prototyping</w:t>
+              <w:t>Prototyping</w:t>
             </w:r>
           </w:p>
         </w:tc>
         <w:tc>
           <w:tcPr>
-            <w:tcW w:w="1708" w:type="dxa"/>
+            <w:tcW w:w="0" w:type="auto"/>
+            <w:hideMark/>
           </w:tcPr>
           <w:p>
             <w:pPr>
+              <w:spacing w:after="160" w:line="278" w:lineRule="auto"/>
               <w:rPr>
-                <w:sz w:val="18"/>
-                <w:szCs w:val="18"/>
+                <w:rFonts w:asciiTheme="majorBidi" w:hAnsiTheme="majorBidi" w:cstheme="majorBidi"/>
+                <w:sz w:val="16"/>
+                <w:szCs w:val="16"/>
               </w:rPr>
             </w:pPr>
             <w:r>
               <w:rPr>
-                <w:sz w:val="18"/>
-                <w:szCs w:val="18"/>
+                <w:rFonts w:asciiTheme="majorBidi" w:hAnsiTheme="majorBidi" w:cstheme="majorBidi"/>
+                <w:sz w:val="16"/>
+                <w:szCs w:val="16"/>
               </w:rPr>
-              <w:t>Validation-driven education</w:t>
+              <w:t>Active Design &amp; Learning</w:t>
             </w:r>
           </w:p>
         </w:tc>
       </w:tr>
       <w:tr>
         <w:trPr>
-          <w:trHeight w:val="340"/>
+          <w:trHeight w:val="373"/>
+          <w:jc w:val="center"/>
         </w:trPr>
         <w:tc>
           <w:tcPr>
-            <w:tcW w:w="1465" w:type="dxa"/>
+            <w:tcW w:w="1101" w:type="dxa"/>
+            <w:hideMark/>
           </w:tcPr>
           <w:p>
             <w:pPr>
+              <w:spacing w:after="160" w:line="278" w:lineRule="auto"/>
               <w:rPr>
-                <w:sz w:val="18"/>
-                <w:szCs w:val="18"/>
+                <w:rFonts w:asciiTheme="majorBidi" w:hAnsiTheme="majorBidi" w:cstheme="majorBidi"/>
+                <w:b/>
+                <w:bCs/>
+                <w:sz w:val="16"/>
+                <w:szCs w:val="16"/>
               </w:rPr>
             </w:pPr>
             <w:r>
               <w:rPr>
-                <w:sz w:val="18"/>
-                <w:szCs w:val="18"/>
+                <w:rFonts w:asciiTheme="majorBidi" w:hAnsiTheme="majorBidi" w:cstheme="majorBidi"/>
+                <w:b/>
+                <w:bCs/>
+                <w:sz w:val="16"/>
+                <w:szCs w:val="16"/>
               </w:rPr>
-              <w:t>Platform</w:t>
+              <w:t>Auto-Wiring</w:t>
             </w:r>
           </w:p>
         </w:tc>
         <w:tc>
           <w:tcPr>
-            <w:tcW w:w="1384" w:type="dxa"/>
+            <w:tcW w:w="649" w:type="dxa"/>
+            <w:hideMark/>
           </w:tcPr>
           <w:p>
             <w:pPr>
+              <w:spacing w:after="160" w:line="278" w:lineRule="auto"/>
               <w:rPr>
-                <w:sz w:val="18"/>
-                <w:szCs w:val="18"/>
+                <w:rFonts w:asciiTheme="majorBidi" w:hAnsiTheme="majorBidi" w:cstheme="majorBidi"/>
+                <w:sz w:val="16"/>
+                <w:szCs w:val="16"/>
               </w:rPr>
             </w:pPr>
             <w:r>
               <w:rPr>
-                <w:sz w:val="18"/>
-                <w:szCs w:val="18"/>
+                <w:rFonts w:asciiTheme="majorBidi" w:hAnsiTheme="majorBidi" w:cstheme="majorBidi"/>
+                <w:sz w:val="16"/>
+                <w:szCs w:val="16"/>
               </w:rPr>
-              <w:t>Web-based</w:t>
+              <w:t>No</w:t>
             </w:r>
           </w:p>
         </w:tc>
         <w:tc>
           <w:tcPr>
-            <w:tcW w:w="1384" w:type="dxa"/>
+            <w:tcW w:w="0" w:type="auto"/>
+            <w:hideMark/>
           </w:tcPr>
           <w:p>
             <w:pPr>
+              <w:spacing w:after="160" w:line="278" w:lineRule="auto"/>
               <w:rPr>
-                <w:sz w:val="18"/>
-                <w:szCs w:val="18"/>
+                <w:rFonts w:asciiTheme="majorBidi" w:hAnsiTheme="majorBidi" w:cstheme="majorBidi"/>
+                <w:sz w:val="16"/>
+                <w:szCs w:val="16"/>
               </w:rPr>
             </w:pPr>
             <w:r>
               <w:rPr>
-                <w:sz w:val="18"/>
-                <w:szCs w:val="18"/>
+                <w:rFonts w:asciiTheme="majorBidi" w:hAnsiTheme="majorBidi" w:cstheme="majorBidi"/>
+                <w:sz w:val="16"/>
+                <w:szCs w:val="16"/>
               </w:rPr>
-              <w:t>Desktop</w:t>
+              <w:t>No</w:t>
             </w:r>
           </w:p>
         </w:tc>
         <w:tc>
           <w:tcPr>
-            <w:tcW w:w="1791" w:type="dxa"/>
+            <w:tcW w:w="0" w:type="auto"/>
+            <w:hideMark/>
           </w:tcPr>
           <w:p>
             <w:pPr>
+              <w:spacing w:after="160" w:line="278" w:lineRule="auto"/>
               <w:rPr>
-                <w:sz w:val="18"/>
-                <w:szCs w:val="18"/>
+                <w:rFonts w:asciiTheme="majorBidi" w:hAnsiTheme="majorBidi" w:cstheme="majorBidi"/>
+                <w:sz w:val="16"/>
+                <w:szCs w:val="16"/>
               </w:rPr>
             </w:pPr>
             <w:r>
               <w:rPr>
-                <w:sz w:val="18"/>
-                <w:szCs w:val="18"/>
+                <w:rFonts w:asciiTheme="majorBidi" w:hAnsiTheme="majorBidi" w:cstheme="majorBidi"/>
+                <w:sz w:val="16"/>
+                <w:szCs w:val="16"/>
               </w:rPr>
-              <w:t>Web-based</w:t>
+              <w:t>No</w:t>
             </w:r>
           </w:p>
         </w:tc>
         <w:tc>
           <w:tcPr>
-            <w:tcW w:w="1628" w:type="dxa"/>
+            <w:tcW w:w="0" w:type="auto"/>
+            <w:hideMark/>
           </w:tcPr>
           <w:p>
             <w:pPr>
+              <w:spacing w:after="160" w:line="278" w:lineRule="auto"/>
               <w:rPr>
-                <w:sz w:val="18"/>
-                <w:szCs w:val="18"/>
+                <w:rFonts w:asciiTheme="majorBidi" w:hAnsiTheme="majorBidi" w:cstheme="majorBidi"/>
+                <w:sz w:val="16"/>
+                <w:szCs w:val="16"/>
               </w:rPr>
             </w:pPr>
             <w:r>
               <w:rPr>
-                <w:sz w:val="18"/>
-                <w:szCs w:val="18"/>
+                <w:rFonts w:asciiTheme="majorBidi" w:hAnsiTheme="majorBidi" w:cstheme="majorBidi"/>
+                <w:sz w:val="16"/>
+                <w:szCs w:val="16"/>
               </w:rPr>
-              <w:t>Web-based</w:t>
+              <w:t>AI-driven (LLM logic)</w:t>
             </w:r>
           </w:p>
         </w:tc>
         <w:tc>
           <w:tcPr>
-            <w:tcW w:w="1708" w:type="dxa"/>
+            <w:tcW w:w="0" w:type="auto"/>
+            <w:hideMark/>
           </w:tcPr>
           <w:p>
             <w:pPr>
+              <w:spacing w:after="160" w:line="278" w:lineRule="auto"/>
               <w:rPr>
-                <w:sz w:val="18"/>
-                <w:szCs w:val="18"/>
+                <w:rFonts w:asciiTheme="majorBidi" w:hAnsiTheme="majorBidi" w:cstheme="majorBidi"/>
+                <w:sz w:val="16"/>
+                <w:szCs w:val="16"/>
               </w:rPr>
             </w:pPr>
             <w:r>
               <w:rPr>
-                <w:sz w:val="18"/>
-                <w:szCs w:val="18"/>
+                <w:rFonts w:asciiTheme="majorBidi" w:hAnsiTheme="majorBidi" w:cstheme="majorBidi"/>
+                <w:sz w:val="16"/>
+                <w:szCs w:val="16"/>
               </w:rPr>
-              <w:t>Web-based</w:t>
+              <w:t>AI &amp; Metadata-driven</w:t>
             </w:r>
           </w:p>
         </w:tc>
       </w:tr>
       <w:tr>
         <w:trPr>
-          <w:trHeight w:val="340"/>
+          <w:trHeight w:val="373"/>
+          <w:jc w:val="center"/>
         </w:trPr>
         <w:tc>
           <w:tcPr>
-            <w:tcW w:w="1465" w:type="dxa"/>
+            <w:tcW w:w="1101" w:type="dxa"/>
+            <w:hideMark/>
           </w:tcPr>
           <w:p>
             <w:pPr>
+              <w:spacing w:after="160" w:line="278" w:lineRule="auto"/>
               <w:rPr>
-                <w:sz w:val="18"/>
-                <w:szCs w:val="18"/>
+                <w:rFonts w:asciiTheme="majorBidi" w:hAnsiTheme="majorBidi" w:cstheme="majorBidi"/>
+                <w:b/>
+                <w:bCs/>
+                <w:sz w:val="16"/>
+                <w:szCs w:val="16"/>
               </w:rPr>
             </w:pPr>
             <w:r>
               <w:rPr>
-                <w:sz w:val="18"/>
-                <w:szCs w:val="18"/>
+                <w:rFonts w:asciiTheme="majorBidi" w:hAnsiTheme="majorBidi" w:cstheme="majorBidi"/>
+                <w:b/>
+                <w:bCs/>
+                <w:sz w:val="16"/>
+                <w:szCs w:val="16"/>
               </w:rPr>
-              <w:t>Board Support</w:t>
+              <w:t>Routing &amp; Layout</w:t>
             </w:r>
           </w:p>
         </w:tc>
         <w:tc>
           <w:tcPr>
-            <w:tcW w:w="1384" w:type="dxa"/>
+            <w:tcW w:w="649" w:type="dxa"/>
+            <w:hideMark/>
           </w:tcPr>
           <w:p>
             <w:pPr>
+              <w:spacing w:after="160" w:line="278" w:lineRule="auto"/>
               <w:rPr>
-                <w:sz w:val="18"/>
-                <w:szCs w:val="18"/>
+                <w:rFonts w:asciiTheme="majorBidi" w:hAnsiTheme="majorBidi" w:cstheme="majorBidi"/>
+                <w:sz w:val="16"/>
+                <w:szCs w:val="16"/>
               </w:rPr>
             </w:pPr>
             <w:r>
               <w:rPr>
-                <w:sz w:val="18"/>
-                <w:szCs w:val="18"/>
+                <w:rFonts w:asciiTheme="majorBidi" w:hAnsiTheme="majorBidi" w:cstheme="majorBidi"/>
+                <w:sz w:val="16"/>
+                <w:szCs w:val="16"/>
               </w:rPr>
-              <w:t xml:space="preserve">Arduino, </w:t>
-            </w:r>
-            <w:proofErr w:type="spellStart"/>
-            <w:proofErr w:type="gramStart"/>
-            <w:r>
-              <w:rPr>
-                <w:sz w:val="18"/>
-                <w:szCs w:val="18"/>
-              </w:rPr>
-              <w:t>Micro:bit</w:t>
-            </w:r>
-            <w:proofErr w:type="spellEnd"/>
-            <w:proofErr w:type="gramEnd"/>
-          </w:p>
-        </w:tc>
-        <w:tc>
-          <w:tcPr>
-            <w:tcW w:w="1384" w:type="dxa"/>
-          </w:tcPr>
-          <w:p>
-            <w:pPr>
-              <w:rPr>
-                <w:sz w:val="18"/>
-                <w:szCs w:val="18"/>
-              </w:rPr>
-            </w:pPr>
-            <w:r>
-              <w:rPr>
-                <w:sz w:val="18"/>
-                <w:szCs w:val="18"/>
-              </w:rPr>
-              <w:t>Visual only</w:t>
+              <w:t>No</w:t>
             </w:r>
           </w:p>
         </w:tc>
         <w:tc>
           <w:tcPr>
-            <w:tcW w:w="1791" w:type="dxa"/>
+            <w:tcW w:w="0" w:type="auto"/>
+            <w:hideMark/>
           </w:tcPr>
           <w:p>
             <w:pPr>
+              <w:spacing w:after="160" w:line="278" w:lineRule="auto"/>
               <w:rPr>
-                <w:sz w:val="18"/>
-                <w:szCs w:val="18"/>
+                <w:rFonts w:asciiTheme="majorBidi" w:hAnsiTheme="majorBidi" w:cstheme="majorBidi"/>
+                <w:sz w:val="16"/>
+                <w:szCs w:val="16"/>
               </w:rPr>
             </w:pPr>
             <w:r>
               <w:rPr>
-                <w:sz w:val="18"/>
-                <w:szCs w:val="18"/>
+                <w:rFonts w:asciiTheme="majorBidi" w:hAnsiTheme="majorBidi" w:cstheme="majorBidi"/>
+                <w:sz w:val="16"/>
+                <w:szCs w:val="16"/>
               </w:rPr>
-              <w:t>Arduino, ESP32, STM32, Pi Pico</w:t>
+              <w:t>No</w:t>
             </w:r>
           </w:p>
         </w:tc>
         <w:tc>
           <w:tcPr>
-            <w:tcW w:w="1628" w:type="dxa"/>
+            <w:tcW w:w="0" w:type="auto"/>
+            <w:hideMark/>
           </w:tcPr>
           <w:p>
             <w:pPr>
+              <w:spacing w:after="160" w:line="278" w:lineRule="auto"/>
               <w:rPr>
-                <w:sz w:val="18"/>
-                <w:szCs w:val="18"/>
+                <w:rFonts w:asciiTheme="majorBidi" w:hAnsiTheme="majorBidi" w:cstheme="majorBidi"/>
+                <w:sz w:val="16"/>
+                <w:szCs w:val="16"/>
               </w:rPr>
             </w:pPr>
             <w:r>
               <w:rPr>
-                <w:sz w:val="18"/>
-                <w:szCs w:val="18"/>
+                <w:rFonts w:asciiTheme="majorBidi" w:hAnsiTheme="majorBidi" w:cstheme="majorBidi"/>
+                <w:sz w:val="16"/>
+                <w:szCs w:val="16"/>
               </w:rPr>
-              <w:t>Arduino, ESP32, RPi</w:t>
+              <w:t>No</w:t>
             </w:r>
           </w:p>
         </w:tc>
         <w:tc>
           <w:tcPr>
-            <w:tcW w:w="1708" w:type="dxa"/>
+            <w:tcW w:w="0" w:type="auto"/>
+            <w:hideMark/>
           </w:tcPr>
           <w:p>
             <w:pPr>
+              <w:spacing w:after="160" w:line="278" w:lineRule="auto"/>
               <w:rPr>
-                <w:sz w:val="18"/>
-                <w:szCs w:val="18"/>
+                <w:rFonts w:asciiTheme="majorBidi" w:hAnsiTheme="majorBidi" w:cstheme="majorBidi"/>
+                <w:sz w:val="16"/>
+                <w:szCs w:val="16"/>
               </w:rPr>
             </w:pPr>
             <w:r>
               <w:rPr>
-                <w:sz w:val="18"/>
-                <w:szCs w:val="18"/>
+                <w:rFonts w:asciiTheme="majorBidi" w:hAnsiTheme="majorBidi" w:cstheme="majorBidi"/>
+                <w:sz w:val="16"/>
+                <w:szCs w:val="16"/>
               </w:rPr>
-              <w:t>Arduino Uno</w:t>
+              <w:t>Dynamic Wire Routing</w:t>
+            </w:r>
+          </w:p>
+        </w:tc>
+        <w:tc>
+          <w:tcPr>
+            <w:tcW w:w="0" w:type="auto"/>
+            <w:hideMark/>
+          </w:tcPr>
+          <w:p>
+            <w:pPr>
+              <w:spacing w:after="160" w:line="278" w:lineRule="auto"/>
+              <w:rPr>
+                <w:rFonts w:asciiTheme="majorBidi" w:hAnsiTheme="majorBidi" w:cstheme="majorBidi"/>
+                <w:sz w:val="16"/>
+                <w:szCs w:val="16"/>
+              </w:rPr>
+            </w:pPr>
+            <w:r>
+              <w:rPr>
+                <w:rFonts w:asciiTheme="majorBidi" w:hAnsiTheme="majorBidi" w:cstheme="majorBidi"/>
+                <w:sz w:val="16"/>
+                <w:szCs w:val="16"/>
+              </w:rPr>
+              <w:t>Orthogonal Routing &amp; Auto-Layout</w:t>
             </w:r>
           </w:p>
         </w:tc>
       </w:tr>
       <w:tr>
         <w:trPr>
-          <w:trHeight w:val="340"/>
+          <w:trHeight w:val="373"/>
+          <w:jc w:val="center"/>
         </w:trPr>
         <w:tc>
           <w:tcPr>
-            <w:tcW w:w="1465" w:type="dxa"/>
+            <w:tcW w:w="1101" w:type="dxa"/>
+            <w:hideMark/>
           </w:tcPr>
           <w:p>
             <w:pPr>
+              <w:spacing w:after="160" w:line="278" w:lineRule="auto"/>
               <w:rPr>
-                <w:sz w:val="18"/>
-                <w:szCs w:val="18"/>
+                <w:rFonts w:asciiTheme="majorBidi" w:hAnsiTheme="majorBidi" w:cstheme="majorBidi"/>
+                <w:b/>
+                <w:bCs/>
+                <w:sz w:val="16"/>
+                <w:szCs w:val="16"/>
               </w:rPr>
             </w:pPr>
             <w:r>
               <w:rPr>
-                <w:sz w:val="18"/>
-                <w:szCs w:val="18"/>
+                <w:rFonts w:asciiTheme="majorBidi" w:hAnsiTheme="majorBidi" w:cstheme="majorBidi"/>
+                <w:b/>
+                <w:bCs/>
+                <w:sz w:val="16"/>
+                <w:szCs w:val="16"/>
               </w:rPr>
-              <w:t>Coding Interface</w:t>
+              <w:t>Error Validation</w:t>
             </w:r>
           </w:p>
         </w:tc>
         <w:tc>
           <w:tcPr>
-            <w:tcW w:w="1384" w:type="dxa"/>
+            <w:tcW w:w="649" w:type="dxa"/>
+            <w:hideMark/>
           </w:tcPr>
           <w:p>
             <w:pPr>
+              <w:spacing w:after="160" w:line="278" w:lineRule="auto"/>
               <w:rPr>
-                <w:sz w:val="18"/>
-                <w:szCs w:val="18"/>
+                <w:rFonts w:asciiTheme="majorBidi" w:hAnsiTheme="majorBidi" w:cstheme="majorBidi"/>
+                <w:sz w:val="16"/>
+                <w:szCs w:val="16"/>
               </w:rPr>
             </w:pPr>
             <w:r>
               <w:rPr>
-                <w:sz w:val="18"/>
-                <w:szCs w:val="18"/>
+                <w:rFonts w:asciiTheme="majorBidi" w:hAnsiTheme="majorBidi" w:cstheme="majorBidi"/>
+                <w:sz w:val="16"/>
+                <w:szCs w:val="16"/>
               </w:rPr>
-              <w:t>Block-based + C++</w:t>
+              <w:t>Post-sim</w:t>
             </w:r>
           </w:p>
         </w:tc>
         <w:tc>
           <w:tcPr>
-            <w:tcW w:w="1384" w:type="dxa"/>
+            <w:tcW w:w="0" w:type="auto"/>
+            <w:hideMark/>
           </w:tcPr>
           <w:p>
             <w:pPr>
+              <w:spacing w:after="160" w:line="278" w:lineRule="auto"/>
               <w:rPr>
-                <w:sz w:val="18"/>
-                <w:szCs w:val="18"/>
+                <w:rFonts w:asciiTheme="majorBidi" w:hAnsiTheme="majorBidi" w:cstheme="majorBidi"/>
+                <w:sz w:val="16"/>
+                <w:szCs w:val="16"/>
               </w:rPr>
             </w:pPr>
             <w:r>
               <w:rPr>
-                <w:sz w:val="18"/>
-                <w:szCs w:val="18"/>
+                <w:rFonts w:asciiTheme="majorBidi" w:hAnsiTheme="majorBidi" w:cstheme="majorBidi"/>
+                <w:sz w:val="16"/>
+                <w:szCs w:val="16"/>
+              </w:rPr>
+              <w:t>No</w:t>
+            </w:r>
+          </w:p>
+        </w:tc>
+        <w:tc>
+          <w:tcPr>
+            <w:tcW w:w="0" w:type="auto"/>
+            <w:hideMark/>
+          </w:tcPr>
+          <w:p>
+            <w:pPr>
+              <w:spacing w:after="160" w:line="278" w:lineRule="auto"/>
+              <w:rPr>
+                <w:rFonts w:asciiTheme="majorBidi" w:hAnsiTheme="majorBidi" w:cstheme="majorBidi"/>
+                <w:sz w:val="16"/>
+                <w:szCs w:val="16"/>
+              </w:rPr>
+            </w:pPr>
+            <w:r>
+              <w:rPr>
+                <w:rFonts w:asciiTheme="majorBidi" w:hAnsiTheme="majorBidi" w:cstheme="majorBidi"/>
+                <w:sz w:val="16"/>
+                <w:szCs w:val="16"/>
+              </w:rPr>
+              <w:t>Post-sim</w:t>
+            </w:r>
+          </w:p>
+        </w:tc>
+        <w:tc>
+          <w:tcPr>
+            <w:tcW w:w="0" w:type="auto"/>
+            <w:hideMark/>
+          </w:tcPr>
+          <w:p>
+            <w:pPr>
+              <w:spacing w:after="160" w:line="278" w:lineRule="auto"/>
+              <w:rPr>
+                <w:rFonts w:asciiTheme="majorBidi" w:hAnsiTheme="majorBidi" w:cstheme="majorBidi"/>
+                <w:sz w:val="16"/>
+                <w:szCs w:val="16"/>
+              </w:rPr>
+            </w:pPr>
+            <w:r>
+              <w:rPr>
+                <w:rFonts w:asciiTheme="majorBidi" w:hAnsiTheme="majorBidi" w:cstheme="majorBidi"/>
+                <w:sz w:val="16"/>
+                <w:szCs w:val="16"/>
+              </w:rPr>
+              <w:t>On-demand (AI review)</w:t>
+            </w:r>
+          </w:p>
+        </w:tc>
+        <w:tc>
+          <w:tcPr>
+            <w:tcW w:w="0" w:type="auto"/>
+            <w:hideMark/>
+          </w:tcPr>
+          <w:p>
+            <w:pPr>
+              <w:spacing w:after="160" w:line="278" w:lineRule="auto"/>
+              <w:rPr>
+                <w:rFonts w:asciiTheme="majorBidi" w:hAnsiTheme="majorBidi" w:cstheme="majorBidi"/>
+                <w:sz w:val="16"/>
+                <w:szCs w:val="16"/>
+              </w:rPr>
+            </w:pPr>
+            <w:r>
+              <w:rPr>
+                <w:rFonts w:asciiTheme="majorBidi" w:hAnsiTheme="majorBidi" w:cstheme="majorBidi"/>
+                <w:sz w:val="16"/>
+                <w:szCs w:val="16"/>
+              </w:rPr>
+              <w:t>Real-time (Rule-based EVE)</w:t>
+            </w:r>
+          </w:p>
+        </w:tc>
+      </w:tr>
+      <w:tr>
+        <w:trPr>
+          <w:trHeight w:val="373"/>
+          <w:jc w:val="center"/>
+        </w:trPr>
+        <w:tc>
+          <w:tcPr>
+            <w:tcW w:w="1101" w:type="dxa"/>
+            <w:hideMark/>
+          </w:tcPr>
+          <w:p>
+            <w:pPr>
+              <w:spacing w:after="160" w:line="278" w:lineRule="auto"/>
+              <w:rPr>
+                <w:rFonts w:asciiTheme="majorBidi" w:hAnsiTheme="majorBidi" w:cstheme="majorBidi"/>
+                <w:b/>
+                <w:bCs/>
+                <w:sz w:val="16"/>
+                <w:szCs w:val="16"/>
+              </w:rPr>
+            </w:pPr>
+            <w:r>
+              <w:rPr>
+                <w:rFonts w:asciiTheme="majorBidi" w:hAnsiTheme="majorBidi" w:cstheme="majorBidi"/>
+                <w:b/>
+                <w:bCs/>
+                <w:sz w:val="16"/>
+                <w:szCs w:val="16"/>
+              </w:rPr>
+              <w:t>Feedback Logic</w:t>
+            </w:r>
+          </w:p>
+        </w:tc>
+        <w:tc>
+          <w:tcPr>
+            <w:tcW w:w="649" w:type="dxa"/>
+            <w:hideMark/>
+          </w:tcPr>
+          <w:p>
+            <w:pPr>
+              <w:spacing w:after="160" w:line="278" w:lineRule="auto"/>
+              <w:rPr>
+                <w:rFonts w:asciiTheme="majorBidi" w:hAnsiTheme="majorBidi" w:cstheme="majorBidi"/>
+                <w:sz w:val="16"/>
+                <w:szCs w:val="16"/>
+              </w:rPr>
+            </w:pPr>
+            <w:r>
+              <w:rPr>
+                <w:rFonts w:asciiTheme="majorBidi" w:hAnsiTheme="majorBidi" w:cstheme="majorBidi"/>
+                <w:sz w:val="16"/>
+                <w:szCs w:val="16"/>
               </w:rPr>
               <w:t>None</w:t>
             </w:r>
@@ -1643,113 +2074,307 @@
         </w:tc>
         <w:tc>
           <w:tcPr>
-            <w:tcW w:w="1791" w:type="dxa"/>
+            <w:tcW w:w="0" w:type="auto"/>
+            <w:hideMark/>
           </w:tcPr>
           <w:p>
             <w:pPr>
+              <w:spacing w:after="160" w:line="278" w:lineRule="auto"/>
               <w:rPr>
-                <w:sz w:val="18"/>
-                <w:szCs w:val="18"/>
+                <w:rFonts w:asciiTheme="majorBidi" w:hAnsiTheme="majorBidi" w:cstheme="majorBidi"/>
+                <w:sz w:val="16"/>
+                <w:szCs w:val="16"/>
               </w:rPr>
             </w:pPr>
             <w:r>
               <w:rPr>
-                <w:sz w:val="18"/>
-                <w:szCs w:val="18"/>
+                <w:rFonts w:asciiTheme="majorBidi" w:hAnsiTheme="majorBidi" w:cstheme="majorBidi"/>
+                <w:sz w:val="16"/>
+                <w:szCs w:val="16"/>
               </w:rPr>
-              <w:t xml:space="preserve">C++, </w:t>
-            </w:r>
-            <w:proofErr w:type="spellStart"/>
-            <w:r>
-              <w:rPr>
-                <w:sz w:val="18"/>
-                <w:szCs w:val="18"/>
-              </w:rPr>
-              <w:t>MicroPython</w:t>
-            </w:r>
-            <w:proofErr w:type="spellEnd"/>
-          </w:p>
-        </w:tc>
-        <w:tc>
-          <w:tcPr>
-            <w:tcW w:w="1628" w:type="dxa"/>
-          </w:tcPr>
-          <w:p>
-            <w:pPr>
-              <w:rPr>
-                <w:sz w:val="18"/>
-                <w:szCs w:val="18"/>
-              </w:rPr>
-            </w:pPr>
-            <w:r>
-              <w:rPr>
-                <w:sz w:val="18"/>
-                <w:szCs w:val="18"/>
-              </w:rPr>
-              <w:t>C++ (VS Code)</w:t>
+              <w:t>None</w:t>
             </w:r>
           </w:p>
         </w:tc>
         <w:tc>
           <w:tcPr>
-            <w:tcW w:w="1708" w:type="dxa"/>
+            <w:tcW w:w="0" w:type="auto"/>
+            <w:hideMark/>
           </w:tcPr>
           <w:p>
             <w:pPr>
+              <w:spacing w:after="160" w:line="278" w:lineRule="auto"/>
               <w:rPr>
-                <w:sz w:val="18"/>
-                <w:szCs w:val="18"/>
+                <w:rFonts w:asciiTheme="majorBidi" w:hAnsiTheme="majorBidi" w:cstheme="majorBidi"/>
+                <w:sz w:val="16"/>
+                <w:szCs w:val="16"/>
               </w:rPr>
             </w:pPr>
             <w:r>
               <w:rPr>
-                <w:sz w:val="18"/>
-                <w:szCs w:val="18"/>
+                <w:rFonts w:asciiTheme="majorBidi" w:hAnsiTheme="majorBidi" w:cstheme="majorBidi"/>
+                <w:sz w:val="16"/>
+                <w:szCs w:val="16"/>
               </w:rPr>
-              <w:t>None (design-focused)</w:t>
+              <w:t>Compiler</w:t>
+            </w:r>
+          </w:p>
+        </w:tc>
+        <w:tc>
+          <w:tcPr>
+            <w:tcW w:w="0" w:type="auto"/>
+            <w:hideMark/>
+          </w:tcPr>
+          <w:p>
+            <w:pPr>
+              <w:spacing w:after="160" w:line="278" w:lineRule="auto"/>
+              <w:rPr>
+                <w:rFonts w:asciiTheme="majorBidi" w:hAnsiTheme="majorBidi" w:cstheme="majorBidi"/>
+                <w:sz w:val="16"/>
+                <w:szCs w:val="16"/>
+              </w:rPr>
+            </w:pPr>
+            <w:r>
+              <w:rPr>
+                <w:rFonts w:asciiTheme="majorBidi" w:hAnsiTheme="majorBidi" w:cstheme="majorBidi"/>
+                <w:sz w:val="16"/>
+                <w:szCs w:val="16"/>
+              </w:rPr>
+              <w:t>Probabilistic</w:t>
+            </w:r>
+          </w:p>
+        </w:tc>
+        <w:tc>
+          <w:tcPr>
+            <w:tcW w:w="0" w:type="auto"/>
+            <w:hideMark/>
+          </w:tcPr>
+          <w:p>
+            <w:pPr>
+              <w:spacing w:after="160" w:line="278" w:lineRule="auto"/>
+              <w:rPr>
+                <w:rFonts w:asciiTheme="majorBidi" w:hAnsiTheme="majorBidi" w:cstheme="majorBidi"/>
+                <w:sz w:val="16"/>
+                <w:szCs w:val="16"/>
+              </w:rPr>
+            </w:pPr>
+            <w:r>
+              <w:rPr>
+                <w:rFonts w:asciiTheme="majorBidi" w:hAnsiTheme="majorBidi" w:cstheme="majorBidi"/>
+                <w:sz w:val="16"/>
+                <w:szCs w:val="16"/>
+              </w:rPr>
+              <w:t>Deterministic</w:t>
             </w:r>
           </w:p>
         </w:tc>
       </w:tr>
       <w:tr>
         <w:trPr>
-          <w:trHeight w:val="340"/>
+          <w:trHeight w:val="373"/>
+          <w:jc w:val="center"/>
         </w:trPr>
         <w:tc>
           <w:tcPr>
-            <w:tcW w:w="1465" w:type="dxa"/>
+            <w:tcW w:w="1101" w:type="dxa"/>
+            <w:hideMark/>
           </w:tcPr>
           <w:p>
             <w:pPr>
+              <w:spacing w:after="160" w:line="278" w:lineRule="auto"/>
               <w:rPr>
-                <w:sz w:val="18"/>
-                <w:szCs w:val="18"/>
+                <w:rFonts w:asciiTheme="majorBidi" w:hAnsiTheme="majorBidi" w:cstheme="majorBidi"/>
+                <w:b/>
+                <w:bCs/>
+                <w:sz w:val="16"/>
+                <w:szCs w:val="16"/>
               </w:rPr>
             </w:pPr>
             <w:r>
               <w:rPr>
-                <w:sz w:val="18"/>
-                <w:szCs w:val="18"/>
+                <w:rFonts w:asciiTheme="majorBidi" w:hAnsiTheme="majorBidi" w:cstheme="majorBidi"/>
+                <w:b/>
+                <w:bCs/>
+                <w:sz w:val="16"/>
+                <w:szCs w:val="16"/>
               </w:rPr>
-              <w:t>Real-Time Simulation</w:t>
+              <w:t>AI Integration</w:t>
             </w:r>
           </w:p>
         </w:tc>
         <w:tc>
           <w:tcPr>
-            <w:tcW w:w="1384" w:type="dxa"/>
+            <w:tcW w:w="649" w:type="dxa"/>
+            <w:hideMark/>
           </w:tcPr>
           <w:p>
             <w:pPr>
+              <w:spacing w:after="160" w:line="278" w:lineRule="auto"/>
               <w:rPr>
-                <w:sz w:val="18"/>
-                <w:szCs w:val="18"/>
+                <w:rFonts w:asciiTheme="majorBidi" w:hAnsiTheme="majorBidi" w:cstheme="majorBidi"/>
+                <w:sz w:val="16"/>
+                <w:szCs w:val="16"/>
               </w:rPr>
             </w:pPr>
             <w:r>
               <w:rPr>
-                <w:sz w:val="18"/>
-                <w:szCs w:val="18"/>
+                <w:rFonts w:asciiTheme="majorBidi" w:hAnsiTheme="majorBidi" w:cstheme="majorBidi"/>
+                <w:sz w:val="16"/>
+                <w:szCs w:val="16"/>
+              </w:rPr>
+              <w:t>No</w:t>
+            </w:r>
+          </w:p>
+        </w:tc>
+        <w:tc>
+          <w:tcPr>
+            <w:tcW w:w="0" w:type="auto"/>
+            <w:hideMark/>
+          </w:tcPr>
+          <w:p>
+            <w:pPr>
+              <w:spacing w:after="160" w:line="278" w:lineRule="auto"/>
+              <w:rPr>
+                <w:rFonts w:asciiTheme="majorBidi" w:hAnsiTheme="majorBidi" w:cstheme="majorBidi"/>
+                <w:sz w:val="16"/>
+                <w:szCs w:val="16"/>
+              </w:rPr>
+            </w:pPr>
+            <w:r>
+              <w:rPr>
+                <w:rFonts w:asciiTheme="majorBidi" w:hAnsiTheme="majorBidi" w:cstheme="majorBidi"/>
+                <w:sz w:val="16"/>
+                <w:szCs w:val="16"/>
+              </w:rPr>
+              <w:t>No</w:t>
+            </w:r>
+          </w:p>
+        </w:tc>
+        <w:tc>
+          <w:tcPr>
+            <w:tcW w:w="0" w:type="auto"/>
+            <w:hideMark/>
+          </w:tcPr>
+          <w:p>
+            <w:pPr>
+              <w:spacing w:after="160" w:line="278" w:lineRule="auto"/>
+              <w:rPr>
+                <w:rFonts w:asciiTheme="majorBidi" w:hAnsiTheme="majorBidi" w:cstheme="majorBidi"/>
+                <w:sz w:val="16"/>
+                <w:szCs w:val="16"/>
+              </w:rPr>
+            </w:pPr>
+            <w:r>
+              <w:rPr>
+                <w:rFonts w:asciiTheme="majorBidi" w:hAnsiTheme="majorBidi" w:cstheme="majorBidi"/>
+                <w:sz w:val="16"/>
+                <w:szCs w:val="16"/>
+              </w:rPr>
+              <w:t>No</w:t>
+            </w:r>
+          </w:p>
+        </w:tc>
+        <w:tc>
+          <w:tcPr>
+            <w:tcW w:w="0" w:type="auto"/>
+            <w:hideMark/>
+          </w:tcPr>
+          <w:p>
+            <w:pPr>
+              <w:spacing w:after="160" w:line="278" w:lineRule="auto"/>
+              <w:rPr>
+                <w:rFonts w:asciiTheme="majorBidi" w:hAnsiTheme="majorBidi" w:cstheme="majorBidi"/>
+                <w:sz w:val="16"/>
+                <w:szCs w:val="16"/>
+              </w:rPr>
+            </w:pPr>
+            <w:r>
+              <w:rPr>
+                <w:rFonts w:asciiTheme="majorBidi" w:hAnsiTheme="majorBidi" w:cstheme="majorBidi"/>
+                <w:sz w:val="16"/>
+                <w:szCs w:val="16"/>
+              </w:rPr>
+              <w:t>Proprietary Generative</w:t>
+            </w:r>
+          </w:p>
+        </w:tc>
+        <w:tc>
+          <w:tcPr>
+            <w:tcW w:w="0" w:type="auto"/>
+            <w:hideMark/>
+          </w:tcPr>
+          <w:p>
+            <w:pPr>
+              <w:spacing w:after="160" w:line="278" w:lineRule="auto"/>
+              <w:rPr>
+                <w:rFonts w:asciiTheme="majorBidi" w:hAnsiTheme="majorBidi" w:cstheme="majorBidi"/>
+                <w:sz w:val="16"/>
+                <w:szCs w:val="16"/>
+              </w:rPr>
+            </w:pPr>
+            <w:r>
+              <w:rPr>
+                <w:rFonts w:asciiTheme="majorBidi" w:hAnsiTheme="majorBidi" w:cstheme="majorBidi"/>
+                <w:sz w:val="16"/>
+                <w:szCs w:val="16"/>
+              </w:rPr>
+              <w:t>Model-Agnostic (Function Calling)</w:t>
+            </w:r>
+          </w:p>
+        </w:tc>
+      </w:tr>
+      <w:tr>
+        <w:trPr>
+          <w:trHeight w:val="373"/>
+          <w:jc w:val="center"/>
+        </w:trPr>
+        <w:tc>
+          <w:tcPr>
+            <w:tcW w:w="1101" w:type="dxa"/>
+            <w:hideMark/>
+          </w:tcPr>
+          <w:p>
+            <w:pPr>
+              <w:spacing w:after="160" w:line="278" w:lineRule="auto"/>
+              <w:rPr>
+                <w:rFonts w:asciiTheme="majorBidi" w:hAnsiTheme="majorBidi" w:cstheme="majorBidi"/>
+                <w:b/>
+                <w:bCs/>
+                <w:sz w:val="16"/>
+                <w:szCs w:val="16"/>
+              </w:rPr>
+            </w:pPr>
+            <w:r>
+              <w:rPr>
+                <w:rFonts w:asciiTheme="majorBidi" w:hAnsiTheme="majorBidi" w:cstheme="majorBidi"/>
+                <w:b/>
+                <w:bCs/>
+                <w:sz w:val="16"/>
+                <w:szCs w:val="16"/>
+              </w:rPr>
+              <w:t>Simulation</w:t>
+            </w:r>
+          </w:p>
+        </w:tc>
+        <w:tc>
+          <w:tcPr>
+            <w:tcW w:w="649" w:type="dxa"/>
+            <w:hideMark/>
+          </w:tcPr>
+          <w:p>
+            <w:pPr>
+              <w:spacing w:after="160" w:line="278" w:lineRule="auto"/>
+              <w:rPr>
+                <w:rFonts w:asciiTheme="majorBidi" w:hAnsiTheme="majorBidi" w:cstheme="majorBidi"/>
+                <w:sz w:val="16"/>
+                <w:szCs w:val="16"/>
+              </w:rPr>
+            </w:pPr>
+            <w:r>
+              <w:rPr>
+                <w:rFonts w:asciiTheme="majorBidi" w:hAnsiTheme="majorBidi" w:cstheme="majorBidi"/>
+                <w:sz w:val="16"/>
+                <w:szCs w:val="16"/>
               </w:rPr>
               <w:t>Basic</w:t>
             </w:r>
@@ -1757,19 +2382,23 @@
         </w:tc>
         <w:tc>
           <w:tcPr>
-            <w:tcW w:w="1384" w:type="dxa"/>
+            <w:tcW w:w="0" w:type="auto"/>
+            <w:hideMark/>
           </w:tcPr>
           <w:p>
             <w:pPr>
+              <w:spacing w:after="160" w:line="278" w:lineRule="auto"/>
               <w:rPr>
-                <w:sz w:val="18"/>
-                <w:szCs w:val="18"/>
+                <w:rFonts w:asciiTheme="majorBidi" w:hAnsiTheme="majorBidi" w:cstheme="majorBidi"/>
+                <w:sz w:val="16"/>
+                <w:szCs w:val="16"/>
               </w:rPr>
             </w:pPr>
             <w:r>
               <w:rPr>
-                <w:sz w:val="18"/>
-                <w:szCs w:val="18"/>
+                <w:rFonts w:asciiTheme="majorBidi" w:hAnsiTheme="majorBidi" w:cstheme="majorBidi"/>
+                <w:sz w:val="16"/>
+                <w:szCs w:val="16"/>
               </w:rPr>
               <w:t>No</w:t>
             </w:r>
@@ -1777,19 +2406,23 @@
         </w:tc>
         <w:tc>
           <w:tcPr>
-            <w:tcW w:w="1791" w:type="dxa"/>
+            <w:tcW w:w="0" w:type="auto"/>
+            <w:hideMark/>
           </w:tcPr>
           <w:p>
             <w:pPr>
+              <w:spacing w:after="160" w:line="278" w:lineRule="auto"/>
               <w:rPr>
-                <w:sz w:val="18"/>
-                <w:szCs w:val="18"/>
+                <w:rFonts w:asciiTheme="majorBidi" w:hAnsiTheme="majorBidi" w:cstheme="majorBidi"/>
+                <w:sz w:val="16"/>
+                <w:szCs w:val="16"/>
               </w:rPr>
             </w:pPr>
             <w:r>
               <w:rPr>
-                <w:sz w:val="18"/>
-                <w:szCs w:val="18"/>
+                <w:rFonts w:asciiTheme="majorBidi" w:hAnsiTheme="majorBidi" w:cstheme="majorBidi"/>
+                <w:sz w:val="16"/>
+                <w:szCs w:val="16"/>
               </w:rPr>
               <w:t>Advanced</w:t>
             </w:r>
@@ -1797,416 +2430,203 @@
         </w:tc>
         <w:tc>
           <w:tcPr>
-            <w:tcW w:w="1628" w:type="dxa"/>
+            <w:tcW w:w="0" w:type="auto"/>
+            <w:hideMark/>
           </w:tcPr>
           <w:p>
             <w:pPr>
+              <w:spacing w:after="160" w:line="278" w:lineRule="auto"/>
               <w:rPr>
-                <w:sz w:val="18"/>
-                <w:szCs w:val="18"/>
+                <w:rFonts w:asciiTheme="majorBidi" w:hAnsiTheme="majorBidi" w:cstheme="majorBidi"/>
+                <w:sz w:val="16"/>
+                <w:szCs w:val="16"/>
               </w:rPr>
             </w:pPr>
             <w:r>
               <w:rPr>
-                <w:sz w:val="18"/>
-                <w:szCs w:val="18"/>
+                <w:rFonts w:asciiTheme="majorBidi" w:hAnsiTheme="majorBidi" w:cstheme="majorBidi"/>
+                <w:sz w:val="16"/>
+                <w:szCs w:val="16"/>
               </w:rPr>
-              <w:t>Yes</w:t>
+              <w:t>Advanced</w:t>
             </w:r>
           </w:p>
         </w:tc>
         <w:tc>
           <w:tcPr>
-            <w:tcW w:w="1708" w:type="dxa"/>
+            <w:tcW w:w="0" w:type="auto"/>
+            <w:hideMark/>
           </w:tcPr>
           <w:p>
             <w:pPr>
+              <w:spacing w:after="160" w:line="278" w:lineRule="auto"/>
               <w:rPr>
-                <w:sz w:val="18"/>
-                <w:szCs w:val="18"/>
+                <w:rFonts w:asciiTheme="majorBidi" w:hAnsiTheme="majorBidi" w:cstheme="majorBidi"/>
+                <w:sz w:val="16"/>
+                <w:szCs w:val="16"/>
               </w:rPr>
             </w:pPr>
             <w:r>
               <w:rPr>
-                <w:sz w:val="18"/>
-                <w:szCs w:val="18"/>
+                <w:rFonts w:asciiTheme="majorBidi" w:hAnsiTheme="majorBidi" w:cstheme="majorBidi"/>
+                <w:sz w:val="16"/>
+                <w:szCs w:val="16"/>
               </w:rPr>
-              <w:t>No</w:t>
+              <w:t>N/A (Project Scope)</w:t>
             </w:r>
           </w:p>
         </w:tc>
       </w:tr>
       <w:tr>
         <w:trPr>
-          <w:trHeight w:val="340"/>
+          <w:trHeight w:val="374"/>
+          <w:jc w:val="center"/>
         </w:trPr>
         <w:tc>
           <w:tcPr>
-            <w:tcW w:w="1465" w:type="dxa"/>
+            <w:tcW w:w="1101" w:type="dxa"/>
+            <w:hideMark/>
           </w:tcPr>
           <w:p>
             <w:pPr>
+              <w:spacing w:after="160" w:line="278" w:lineRule="auto"/>
               <w:rPr>
-                <w:sz w:val="18"/>
-                <w:szCs w:val="18"/>
+                <w:rFonts w:asciiTheme="majorBidi" w:hAnsiTheme="majorBidi" w:cstheme="majorBidi"/>
+                <w:b/>
+                <w:bCs/>
+                <w:sz w:val="16"/>
+                <w:szCs w:val="16"/>
               </w:rPr>
             </w:pPr>
             <w:r>
               <w:rPr>
-                <w:sz w:val="18"/>
-                <w:szCs w:val="18"/>
+                <w:rFonts w:asciiTheme="majorBidi" w:hAnsiTheme="majorBidi" w:cstheme="majorBidi"/>
+                <w:b/>
+                <w:bCs/>
+                <w:sz w:val="16"/>
+                <w:szCs w:val="16"/>
               </w:rPr>
-              <w:t>Real-Time Validation</w:t>
+              <w:t>Cost Model</w:t>
             </w:r>
           </w:p>
         </w:tc>
         <w:tc>
           <w:tcPr>
-            <w:tcW w:w="1384" w:type="dxa"/>
+            <w:tcW w:w="649" w:type="dxa"/>
+            <w:hideMark/>
           </w:tcPr>
           <w:p>
             <w:pPr>
+              <w:spacing w:after="160" w:line="278" w:lineRule="auto"/>
               <w:rPr>
-                <w:sz w:val="18"/>
-                <w:szCs w:val="18"/>
+                <w:rFonts w:asciiTheme="majorBidi" w:hAnsiTheme="majorBidi" w:cstheme="majorBidi"/>
+                <w:sz w:val="16"/>
+                <w:szCs w:val="16"/>
               </w:rPr>
             </w:pPr>
             <w:r>
               <w:rPr>
-                <w:sz w:val="18"/>
-                <w:szCs w:val="18"/>
+                <w:rFonts w:asciiTheme="majorBidi" w:hAnsiTheme="majorBidi" w:cstheme="majorBidi"/>
+                <w:sz w:val="16"/>
+                <w:szCs w:val="16"/>
               </w:rPr>
-              <w:t>No</w:t>
+              <w:t>Free</w:t>
             </w:r>
           </w:p>
         </w:tc>
         <w:tc>
           <w:tcPr>
-            <w:tcW w:w="1384" w:type="dxa"/>
+            <w:tcW w:w="0" w:type="auto"/>
+            <w:hideMark/>
           </w:tcPr>
           <w:p>
             <w:pPr>
+              <w:spacing w:after="160" w:line="278" w:lineRule="auto"/>
               <w:rPr>
-                <w:sz w:val="18"/>
-                <w:szCs w:val="18"/>
+                <w:rFonts w:asciiTheme="majorBidi" w:hAnsiTheme="majorBidi" w:cstheme="majorBidi"/>
+                <w:sz w:val="16"/>
+                <w:szCs w:val="16"/>
               </w:rPr>
             </w:pPr>
             <w:r>
               <w:rPr>
-                <w:sz w:val="18"/>
-                <w:szCs w:val="18"/>
+                <w:rFonts w:asciiTheme="majorBidi" w:hAnsiTheme="majorBidi" w:cstheme="majorBidi"/>
+                <w:sz w:val="16"/>
+                <w:szCs w:val="16"/>
               </w:rPr>
-              <w:t>No</w:t>
+              <w:t>Paid</w:t>
             </w:r>
           </w:p>
         </w:tc>
         <w:tc>
           <w:tcPr>
-            <w:tcW w:w="1791" w:type="dxa"/>
+            <w:tcW w:w="0" w:type="auto"/>
+            <w:hideMark/>
           </w:tcPr>
           <w:p>
             <w:pPr>
+              <w:spacing w:after="160" w:line="278" w:lineRule="auto"/>
               <w:rPr>
-                <w:sz w:val="18"/>
-                <w:szCs w:val="18"/>
+                <w:rFonts w:asciiTheme="majorBidi" w:hAnsiTheme="majorBidi" w:cstheme="majorBidi"/>
+                <w:sz w:val="16"/>
+                <w:szCs w:val="16"/>
               </w:rPr>
             </w:pPr>
             <w:r>
               <w:rPr>
-                <w:sz w:val="18"/>
-                <w:szCs w:val="18"/>
+                <w:rFonts w:asciiTheme="majorBidi" w:hAnsiTheme="majorBidi" w:cstheme="majorBidi"/>
+                <w:sz w:val="16"/>
+                <w:szCs w:val="16"/>
               </w:rPr>
-              <w:t>No</w:t>
+              <w:t>Freemium</w:t>
             </w:r>
           </w:p>
         </w:tc>
         <w:tc>
           <w:tcPr>
-            <w:tcW w:w="1628" w:type="dxa"/>
+            <w:tcW w:w="0" w:type="auto"/>
+            <w:hideMark/>
           </w:tcPr>
           <w:p>
             <w:pPr>
+              <w:spacing w:after="160" w:line="278" w:lineRule="auto"/>
               <w:rPr>
-                <w:sz w:val="18"/>
-                <w:szCs w:val="18"/>
+                <w:rFonts w:asciiTheme="majorBidi" w:hAnsiTheme="majorBidi" w:cstheme="majorBidi"/>
+                <w:sz w:val="16"/>
+                <w:szCs w:val="16"/>
               </w:rPr>
             </w:pPr>
             <w:r>
               <w:rPr>
-                <w:sz w:val="18"/>
-                <w:szCs w:val="18"/>
+                <w:rFonts w:asciiTheme="majorBidi" w:hAnsiTheme="majorBidi" w:cstheme="majorBidi"/>
+                <w:sz w:val="16"/>
+                <w:szCs w:val="16"/>
               </w:rPr>
-              <w:t>No (AI text only)</w:t>
+              <w:t>Freemium</w:t>
             </w:r>
           </w:p>
         </w:tc>
         <w:tc>
           <w:tcPr>
-            <w:tcW w:w="1708" w:type="dxa"/>
+            <w:tcW w:w="0" w:type="auto"/>
+            <w:hideMark/>
           </w:tcPr>
           <w:p>
             <w:pPr>
+              <w:spacing w:after="160" w:line="278" w:lineRule="auto"/>
               <w:rPr>
-                <w:sz w:val="18"/>
-                <w:szCs w:val="18"/>
+                <w:rFonts w:asciiTheme="majorBidi" w:hAnsiTheme="majorBidi" w:cstheme="majorBidi"/>
+                <w:sz w:val="16"/>
+                <w:szCs w:val="16"/>
               </w:rPr>
             </w:pPr>
             <w:r>
               <w:rPr>
-                <w:sz w:val="18"/>
-                <w:szCs w:val="18"/>
+                <w:rFonts w:asciiTheme="majorBidi" w:hAnsiTheme="majorBidi" w:cstheme="majorBidi"/>
+                <w:sz w:val="16"/>
+                <w:szCs w:val="16"/>
               </w:rPr>
-              <w:t>Yes (9 rules)</w:t>
-            </w:r>
-          </w:p>
-        </w:tc>
-      </w:tr>
-      <w:tr>
-        <w:trPr>
-          <w:trHeight w:val="340"/>
-        </w:trPr>
-        <w:tc>
-          <w:tcPr>
-            <w:tcW w:w="1465" w:type="dxa"/>
-          </w:tcPr>
-          <w:p>
-            <w:pPr>
-              <w:rPr>
-                <w:sz w:val="18"/>
-                <w:szCs w:val="18"/>
-              </w:rPr>
-            </w:pPr>
-            <w:r>
-              <w:rPr>
-                <w:sz w:val="18"/>
-                <w:szCs w:val="18"/>
-              </w:rPr>
-              <w:t>Auto-Wiring</w:t>
-            </w:r>
-          </w:p>
-        </w:tc>
-        <w:tc>
-          <w:tcPr>
-            <w:tcW w:w="1384" w:type="dxa"/>
-          </w:tcPr>
-          <w:p>
-            <w:pPr>
-              <w:rPr>
-                <w:sz w:val="18"/>
-                <w:szCs w:val="18"/>
-              </w:rPr>
-            </w:pPr>
-            <w:r>
-              <w:rPr>
-                <w:sz w:val="18"/>
-                <w:szCs w:val="18"/>
-              </w:rPr>
-              <w:t>No</w:t>
-            </w:r>
-          </w:p>
-        </w:tc>
-        <w:tc>
-          <w:tcPr>
-            <w:tcW w:w="1384" w:type="dxa"/>
-          </w:tcPr>
-          <w:p>
-            <w:pPr>
-              <w:rPr>
-                <w:sz w:val="18"/>
-                <w:szCs w:val="18"/>
-              </w:rPr>
-            </w:pPr>
-            <w:r>
-              <w:rPr>
-                <w:sz w:val="18"/>
-                <w:szCs w:val="18"/>
-              </w:rPr>
-              <w:t>No</w:t>
-            </w:r>
-          </w:p>
-        </w:tc>
-        <w:tc>
-          <w:tcPr>
-            <w:tcW w:w="1791" w:type="dxa"/>
-          </w:tcPr>
-          <w:p>
-            <w:pPr>
-              <w:rPr>
-                <w:sz w:val="18"/>
-                <w:szCs w:val="18"/>
-              </w:rPr>
-            </w:pPr>
-            <w:r>
-              <w:rPr>
-                <w:sz w:val="18"/>
-                <w:szCs w:val="18"/>
-              </w:rPr>
-              <w:t>No</w:t>
-            </w:r>
-          </w:p>
-        </w:tc>
-        <w:tc>
-          <w:tcPr>
-            <w:tcW w:w="1628" w:type="dxa"/>
-          </w:tcPr>
-          <w:p>
-            <w:pPr>
-              <w:rPr>
-                <w:sz w:val="18"/>
-                <w:szCs w:val="18"/>
-              </w:rPr>
-            </w:pPr>
-            <w:r>
-              <w:rPr>
-                <w:sz w:val="18"/>
-                <w:szCs w:val="18"/>
-              </w:rPr>
-              <w:t>No (text only)</w:t>
-            </w:r>
-          </w:p>
-        </w:tc>
-        <w:tc>
-          <w:tcPr>
-            <w:tcW w:w="1708" w:type="dxa"/>
-          </w:tcPr>
-          <w:p>
-            <w:pPr>
-              <w:rPr>
-                <w:sz w:val="18"/>
-                <w:szCs w:val="18"/>
-              </w:rPr>
-            </w:pPr>
-            <w:r>
-              <w:rPr>
-                <w:sz w:val="18"/>
-                <w:szCs w:val="18"/>
-              </w:rPr>
-              <w:t>Yes (metadata-driven)</w:t>
-            </w:r>
-          </w:p>
-        </w:tc>
-      </w:tr>
-      <w:tr>
-        <w:trPr>
-          <w:trHeight w:val="340"/>
-        </w:trPr>
-        <w:tc>
-          <w:tcPr>
-            <w:tcW w:w="1465" w:type="dxa"/>
-          </w:tcPr>
-          <w:p>
-            <w:pPr>
-              <w:rPr>
-                <w:sz w:val="18"/>
-                <w:szCs w:val="18"/>
-              </w:rPr>
-            </w:pPr>
-            <w:r>
-              <w:rPr>
-                <w:sz w:val="18"/>
-                <w:szCs w:val="18"/>
-              </w:rPr>
-              <w:t>Pedagogical Feedback</w:t>
-            </w:r>
-          </w:p>
-        </w:tc>
-        <w:tc>
-          <w:tcPr>
-            <w:tcW w:w="1384" w:type="dxa"/>
-          </w:tcPr>
-          <w:p>
-            <w:pPr>
-              <w:rPr>
-                <w:sz w:val="18"/>
-                <w:szCs w:val="18"/>
-              </w:rPr>
-            </w:pPr>
-            <w:r>
-              <w:rPr>
-                <w:sz w:val="18"/>
-                <w:szCs w:val="18"/>
-              </w:rPr>
-              <w:t>No</w:t>
-            </w:r>
-          </w:p>
-        </w:tc>
-        <w:tc>
-          <w:tcPr>
-            <w:tcW w:w="1384" w:type="dxa"/>
-          </w:tcPr>
-          <w:p>
-            <w:pPr>
-              <w:rPr>
-                <w:sz w:val="18"/>
-                <w:szCs w:val="18"/>
-              </w:rPr>
-            </w:pPr>
-            <w:r>
-              <w:rPr>
-                <w:sz w:val="18"/>
-                <w:szCs w:val="18"/>
-              </w:rPr>
-              <w:t>No</w:t>
-            </w:r>
-          </w:p>
-        </w:tc>
-        <w:tc>
-          <w:tcPr>
-            <w:tcW w:w="1791" w:type="dxa"/>
-          </w:tcPr>
-          <w:p>
-            <w:pPr>
-              <w:rPr>
-                <w:sz w:val="18"/>
-                <w:szCs w:val="18"/>
-              </w:rPr>
-            </w:pPr>
-            <w:r>
-              <w:rPr>
-                <w:sz w:val="18"/>
-                <w:szCs w:val="18"/>
-              </w:rPr>
-              <w:t>No</w:t>
-            </w:r>
-          </w:p>
-        </w:tc>
-        <w:tc>
-          <w:tcPr>
-            <w:tcW w:w="1628" w:type="dxa"/>
-          </w:tcPr>
-          <w:p>
-            <w:pPr>
-              <w:rPr>
-                <w:sz w:val="18"/>
-                <w:szCs w:val="18"/>
-              </w:rPr>
-            </w:pPr>
-            <w:r>
-              <w:rPr>
-                <w:sz w:val="18"/>
-                <w:szCs w:val="18"/>
-              </w:rPr>
-              <w:t>Partial (AI)</w:t>
-            </w:r>
-          </w:p>
-        </w:tc>
-        <w:tc>
-          <w:tcPr>
-            <w:tcW w:w="1708" w:type="dxa"/>
-          </w:tcPr>
-          <w:p>
-            <w:pPr>
-              <w:rPr>
-                <w:sz w:val="18"/>
-                <w:szCs w:val="18"/>
-              </w:rPr>
-            </w:pPr>
-            <w:r>
-              <w:rPr>
-                <w:sz w:val="18"/>
-                <w:szCs w:val="18"/>
-              </w:rPr>
-              <w:t>Yes (rule-based)</w:t>
+              <w:t>Free</w:t>
             </w:r>
           </w:p>
         </w:tc>
@@ -2220,6 +2640,23 @@
           <w:rFonts w:cs="Times New Roman"/>
           <w:szCs w:val="20"/>
         </w:rPr>
+        <w:sectPr>
+          <w:type w:val="continuous"/>
+          <w:pgSz w:w="12240" w:h="15840"/>
+          <w:pgMar w:top="1080" w:right="893" w:bottom="1440" w:left="893" w:header="720" w:footer="720" w:gutter="0"/>
+          <w:cols w:space="360"/>
+          <w:docGrid w:linePitch="360"/>
+        </w:sectPr>
+      </w:pPr>
+    </w:p>
+    <w:p>
+      <w:pPr>
+        <w:spacing w:after="120" w:line="228" w:lineRule="auto"/>
+        <w:ind w:firstLine="288"/>
+        <w:rPr>
+          <w:rFonts w:cs="Times New Roman"/>
+          <w:szCs w:val="20"/>
+        </w:rPr>
       </w:pPr>
     </w:p>
     <w:p>
@@ -2276,15 +2713,7 @@
           <w:rFonts w:cs="Times New Roman"/>
           <w:szCs w:val="20"/>
         </w:rPr>
-        <w:t xml:space="preserve">The project is organised into seven sprints: (1) interactive canvas with component placement, grid snapping, and pan/zoom, (2) component library with metadata and the sidebar interface, (3) manual pin-to-pin wiring with orthogonal routing, (4) validation engine covering nine rules and the </w:t>
-      </w:r>
-      <w:r>
-        <w:rPr>
-          <w:rFonts w:cs="Times New Roman"/>
-          <w:szCs w:val="20"/>
-        </w:rPr>
-        <w:lastRenderedPageBreak/>
-        <w:t>validation bar UI, (5) auto-wire engine with smart pin assignment, (6) state management upgrades including undo/redo, localStorage persistence, and anti-overlap collision detection, and (7) integration testing, UI polish, and wire cleanup features.</w:t>
+        <w:t>The project is organised into seven sprints: (1) interactive canvas with component placement, grid snapping, and pan/zoom, (2) component library with metadata and the sidebar interface, (3) manual pin-to-pin wiring with orthogonal routing, (4) validation engine covering nine rules and the validation bar UI, (5) auto-wire engine with smart pin assignment, (6) state management upgrades including undo/redo, localStorage persistence, and anti-overlap collision detection, and (7) integration testing, UI polish, and wire cleanup features.</w:t>
       </w:r>
     </w:p>
     <w:p>
@@ -2348,33 +2777,166 @@
       <w:pPr>
         <w:spacing w:after="120" w:line="228" w:lineRule="auto"/>
         <w:ind w:firstLine="288"/>
-      </w:pPr>
-      <w:r>
         <w:rPr>
           <w:rFonts w:cs="Times New Roman"/>
           <w:szCs w:val="20"/>
         </w:rPr>
-        <w:t xml:space="preserve">The survey respondents </w:t>
-      </w:r>
+      </w:pPr>
       <w:r>
         <w:rPr>
           <w:rFonts w:cs="Times New Roman"/>
           <w:szCs w:val="20"/>
         </w:rPr>
-        <w:t>comprised</w:t>
+        <w:t xml:space="preserve">Requirements were formally gathered through a needs analysis questionnaire distributed to 35 undergraduate students from </w:t>
       </w:r>
       <w:r>
         <w:rPr>
           <w:rFonts w:cs="Times New Roman"/>
           <w:szCs w:val="20"/>
         </w:rPr>
-        <w:t xml:space="preserve"> mainly Mechatronics Engineering (51%) and Electrical Engineering (20%) students, with 80% in Year 3 or Year 4 and 86% having prior Arduino experience. Results showed that 60% of respondents rated their satisfaction with error feedback in existing tools at 2 or below on a 5-point Likert scale (mean: 2.31). The most frequently reported method of discovering wiring errors was manual debugging (51%), followed by component damage (23%) and instructor intervention (14%). Only 9% reported simulation failure as their primary means of error detection. Real-time validation with explanatory feedback received the highest mean ratings among all features surveyed (Q10 mean: 4.66, Q11 mean: 4.69 out of 5). When asked to select the single most important feature, 49% chose real-time validation with error explanations. Respondents also expressed dissatisfaction with the circuit-building experience in current tools, reporting that wires become messy and hard to manage as circuits grow, and that there is no easy way to clean up or re-route existing connections. Overall adoption intent was high, with 88% of respondents indicating they would probably or definitely use the system.</w:t>
+        <w:t xml:space="preserve">and the Kulliyyah of Engineering </w:t>
+      </w:r>
+      <w:r>
+        <w:rPr>
+          <w:rFonts w:cs="Times New Roman"/>
+          <w:szCs w:val="20"/>
+        </w:rPr>
+        <w:t>K</w:t>
+      </w:r>
+      <w:r>
+        <w:rPr>
+          <w:rFonts w:cs="Times New Roman"/>
+          <w:szCs w:val="20"/>
+        </w:rPr>
+        <w:t>ulliyyah of Information and Communication Technology</w:t>
+      </w:r>
+      <w:r>
+        <w:rPr>
+          <w:rFonts w:cs="Times New Roman"/>
+          <w:szCs w:val="20"/>
+        </w:rPr>
+        <w:t xml:space="preserve"> at IIUM. This primary data collection method was utilized to identify common pain points in existing tools and scientifically justify the proposed system features.</w:t>
       </w:r>
     </w:p>
     <w:p>
       <w:pPr>
         <w:spacing w:after="120" w:line="228" w:lineRule="auto"/>
         <w:ind w:firstLine="288"/>
+      </w:pPr>
+      <w:r>
+        <w:rPr>
+          <w:rFonts w:cs="Times New Roman"/>
+          <w:szCs w:val="20"/>
+        </w:rPr>
+        <w:t>The survey findings confirmed a high prevalence of time wasted on manual debugging and frequent component damage due to undetected wiring errors. Crucially, respondents indicated low satisfaction with the passive error feedback mechanisms found in current virtual simulators. The data revealed that the highest user demand was for real-time validation with explanatory educational feedback, followed closely by automated pin-to-pin wiring. These specific insights provided the foundational justification for prioritizing the rule-</w:t>
+      </w:r>
+      <w:r>
+        <w:rPr>
+          <w:rFonts w:cs="Times New Roman"/>
+          <w:szCs w:val="20"/>
+        </w:rPr>
+        <w:t>based validation engine (EVE) and the auto-wiring engine in</w:t>
+      </w:r>
+      <w:r>
+        <w:rPr>
+          <w:rFonts w:cs="Times New Roman"/>
+          <w:szCs w:val="20"/>
+        </w:rPr>
+        <w:t xml:space="preserve"> </w:t>
+      </w:r>
+      <w:r>
+        <w:rPr>
+          <w:rFonts w:cs="Times New Roman"/>
+          <w:szCs w:val="20"/>
+        </w:rPr>
+        <w:t>the system's logical design, ensuring the development directly addresses the target audience's core needs.</w:t>
+      </w:r>
+    </w:p>
+    <w:p>
+      <w:pPr>
+        <w:spacing w:after="120" w:line="228" w:lineRule="auto"/>
+        <w:ind w:firstLine="288"/>
+      </w:pPr>
+      <w:r>
+        <w:rPr>
+          <w:rFonts w:cs="Times New Roman"/>
+          <w:szCs w:val="20"/>
+        </w:rPr>
+        <w:t>These findings directly informed the prioritisation of the Validation Engine as the primary system contribution and the inclusion of automatic wire cleanup as a planned feature.</w:t>
+      </w:r>
+    </w:p>
+    <w:p>
+      <w:pPr>
+        <w:keepNext/>
+        <w:spacing w:before="120" w:after="60" w:line="228" w:lineRule="auto"/>
+        <w:jc w:val="left"/>
+      </w:pPr>
+      <w:r>
+        <w:rPr>
+          <w:rFonts w:cs="Times New Roman"/>
+          <w:i/>
+          <w:iCs/>
+          <w:szCs w:val="20"/>
+        </w:rPr>
+        <w:t>C. Logical Design</w:t>
+      </w:r>
+    </w:p>
+    <w:p>
+      <w:pPr>
+        <w:spacing w:after="120" w:line="228" w:lineRule="auto"/>
+        <w:ind w:firstLine="288"/>
+      </w:pPr>
+      <w:r>
+        <w:rPr>
+          <w:rFonts w:cs="Times New Roman"/>
+          <w:szCs w:val="20"/>
+        </w:rPr>
+        <w:t>The logical design of Elera describes the system's structure and behaviour through standard UML diagrams. This subsection presents the narrative that accompanies each diagram.</w:t>
+      </w:r>
+    </w:p>
+    <w:p>
+      <w:pPr>
+        <w:spacing w:after="120" w:line="228" w:lineRule="auto"/>
+        <w:ind w:firstLine="288"/>
+        <w:rPr>
+          <w:rFonts w:cs="Times New Roman"/>
+          <w:szCs w:val="20"/>
+        </w:rPr>
+      </w:pPr>
+      <w:r>
+        <w:rPr>
+          <w:rFonts w:cs="Times New Roman"/>
+          <w:b/>
+          <w:bCs/>
+          <w:szCs w:val="20"/>
+        </w:rPr>
+        <w:t xml:space="preserve">System Architecture. </w:t>
+      </w:r>
+      <w:r>
+        <w:rPr>
+          <w:rFonts w:cs="Times New Roman"/>
+          <w:szCs w:val="20"/>
+        </w:rPr>
+        <w:t>Elera uses a modular architecture built with Lit 3 Web Components. The system comprises twelve modules that communicate through an event-driven pattern. When a user performs an action on the canvas, such as placing a wire, the Circuit Store updates its internal state and fires a "structural-change" event. The Validation Engine listens for that event, re-checks the circuit, and sends the results to the Validation Bar, which re-renders automatically. The user sees updated feedback without any manual refresh.</w:t>
+      </w:r>
+      <w:r>
+        <w:rPr>
+          <w:rFonts w:cs="Times New Roman"/>
+          <w:szCs w:val="20"/>
+        </w:rPr>
+        <w:t xml:space="preserve"> </w:t>
+      </w:r>
+      <w:r>
+        <w:rPr>
+          <w:rFonts w:cs="Times New Roman"/>
+          <w:szCs w:val="20"/>
+        </w:rPr>
+        <w:t xml:space="preserve">The modules are grouped into three layers. The UI layer consists of Circuit App, Component Sidebar, Circuit Canvas, Placed Component, Validation Bar, AI Assistant, and Component Builder. The Service layer consists of the Validation Engine and Auto-Wire Engine. The Data layer consists of the Circuit Store and Component Library. </w:t>
+      </w:r>
+    </w:p>
+    <w:p>
+      <w:pPr>
+        <w:spacing w:after="120" w:line="228" w:lineRule="auto"/>
       </w:pPr>
       <w:r>
         <w:rPr>
@@ -2384,16 +2946,171 @@
           <w:noProof/>
           <w:szCs w:val="20"/>
         </w:rPr>
+        <w:drawing>
+          <wp:inline distT="0" distB="0" distL="0" distR="0" wp14:anchorId="21C81C67" wp14:editId="0DC85240">
+            <wp:extent cx="3200400" cy="2470150"/>
+            <wp:effectExtent l="0" t="0" r="0" b="6350"/>
+            <wp:docPr id="120644736" name="Picture 6"/>
+            <wp:cNvGraphicFramePr>
+              <a:graphicFrameLocks xmlns:a="http://schemas.openxmlformats.org/drawingml/2006/main" noChangeAspect="1"/>
+            </wp:cNvGraphicFramePr>
+            <a:graphic xmlns:a="http://schemas.openxmlformats.org/drawingml/2006/main">
+              <a:graphicData uri="http://schemas.openxmlformats.org/drawingml/2006/picture">
+                <pic:pic xmlns:pic="http://schemas.openxmlformats.org/drawingml/2006/picture">
+                  <pic:nvPicPr>
+                    <pic:cNvPr id="0" name="Picture 6"/>
+                    <pic:cNvPicPr>
+                      <a:picLocks noChangeAspect="1" noChangeArrowheads="1"/>
+                    </pic:cNvPicPr>
+                  </pic:nvPicPr>
+                  <pic:blipFill>
+                    <a:blip r:embed="rId8">
+                      <a:extLst>
+                        <a:ext uri="{28A0092B-C50C-407E-A947-70E740481C1C}">
+                          <a14:useLocalDpi xmlns:a14="http://schemas.microsoft.com/office/drawing/2010/main" val="0"/>
+                        </a:ext>
+                      </a:extLst>
+                    </a:blip>
+                    <a:srcRect/>
+                    <a:stretch>
+                      <a:fillRect/>
+                    </a:stretch>
+                  </pic:blipFill>
+                  <pic:spPr bwMode="auto">
+                    <a:xfrm>
+                      <a:off x="0" y="0"/>
+                      <a:ext cx="3200400" cy="2470150"/>
+                    </a:xfrm>
+                    <a:prstGeom prst="rect">
+                      <a:avLst/>
+                    </a:prstGeom>
+                    <a:noFill/>
+                    <a:ln>
+                      <a:noFill/>
+                    </a:ln>
+                  </pic:spPr>
+                </pic:pic>
+              </a:graphicData>
+            </a:graphic>
+          </wp:inline>
+        </w:drawing>
+      </w:r>
+    </w:p>
+    <w:p>
+      <w:pPr>
+        <w:pStyle w:val="Caption"/>
+        <w:keepNext/>
+        <w:jc w:val="center"/>
+        <w:rPr>
+          <w:color w:val="000000" w:themeColor="text1"/>
+        </w:rPr>
+      </w:pPr>
+      <w:r>
+        <w:rPr>
+          <w:color w:val="000000" w:themeColor="text1"/>
+        </w:rPr>
+        <w:t>Fig</w:t>
+      </w:r>
+      <w:r>
+        <w:rPr>
+          <w:color w:val="000000" w:themeColor="text1"/>
+        </w:rPr>
+        <w:t>.</w:t>
+      </w:r>
+      <w:r>
+        <w:rPr>
+          <w:color w:val="000000" w:themeColor="text1"/>
+        </w:rPr>
+        <w:t xml:space="preserve"> 1: </w:t>
+      </w:r>
+      <w:r>
+        <w:rPr>
+          <w:color w:val="000000" w:themeColor="text1"/>
+        </w:rPr>
+        <w:t>S</w:t>
+      </w:r>
+      <w:r>
+        <w:rPr>
+          <w:color w:val="000000" w:themeColor="text1"/>
+        </w:rPr>
+        <w:t>ystem architecture diagram</w:t>
+      </w:r>
+    </w:p>
+    <w:p>
+      <w:pPr>
+        <w:spacing w:after="120" w:line="228" w:lineRule="auto"/>
+        <w:ind w:firstLine="288"/>
+        <w:rPr>
+          <w:rFonts w:cs="Times New Roman"/>
+          <w:szCs w:val="20"/>
+        </w:rPr>
+      </w:pPr>
+      <w:r>
+        <w:rPr>
+          <w:rFonts w:cs="Times New Roman"/>
+          <w:b/>
+          <w:bCs/>
+          <w:szCs w:val="20"/>
+        </w:rPr>
+        <w:t xml:space="preserve">Use Case Diagram. </w:t>
+      </w:r>
+      <w:r>
+        <w:rPr>
+          <w:rFonts w:cs="Times New Roman"/>
+          <w:szCs w:val="20"/>
+        </w:rPr>
+        <w:t>The primary actor is the Student. The use cases are grouped into four packages: Component Management, Wiring, Validation, and Project. The Wiring package captures both paths available to the student. In the manual path, the student clicks a source pin and a destination</w:t>
+      </w:r>
+      <w:r>
+        <w:rPr>
+          <w:rFonts w:cs="Times New Roman"/>
+          <w:szCs w:val="20"/>
+        </w:rPr>
+        <w:t xml:space="preserve"> </w:t>
+      </w:r>
+    </w:p>
+    <w:p>
+      <w:pPr>
+        <w:spacing w:after="120" w:line="228" w:lineRule="auto"/>
+      </w:pPr>
+      <w:r>
+        <w:rPr>
+          <w:rFonts w:cs="Times New Roman"/>
+          <w:szCs w:val="20"/>
+        </w:rPr>
+        <w:lastRenderedPageBreak/>
+        <w:t>pin to create a wire. In the auto-wire path, the student triggers the engine and the system assigns pins and generates wires automatically. After either path, the Validation Engine runs and the student views the results in the Validation Bar. If errors are present, the student adjusts the circuit and the cycle repeats. This feedback loop is the core interaction pattern of the system.</w:t>
+      </w:r>
+      <w:r>
+        <w:rPr>
+          <w:rFonts w:cs="Times New Roman"/>
+          <w:szCs w:val="20"/>
+        </w:rPr>
+        <w:t xml:space="preserve"> </w:t>
+      </w:r>
+      <w:r>
+        <w:rPr>
+          <w:rFonts w:cs="Times New Roman"/>
+          <w:szCs w:val="20"/>
+        </w:rPr>
+        <w:t xml:space="preserve"> </w:t>
+      </w:r>
+      <w:r>
+        <w:rPr>
+          <w:rFonts w:cs="Times New Roman"/>
+          <w:noProof/>
+          <w:szCs w:val="20"/>
+        </w:rPr>
         <mc:AlternateContent>
           <mc:Choice Requires="wps">
             <w:drawing>
-              <wp:anchor distT="45720" distB="45720" distL="114300" distR="114300" simplePos="0" relativeHeight="251659776" behindDoc="0" locked="0" layoutInCell="1" allowOverlap="1" wp14:anchorId="31E12F1B" wp14:editId="5D867674">
+              <wp:anchor distT="45720" distB="45720" distL="114300" distR="114300" simplePos="0" relativeHeight="251659264" behindDoc="0" locked="0" layoutInCell="1" allowOverlap="1" wp14:anchorId="564E675A" wp14:editId="18DFB9E5">
                 <wp:simplePos x="0" y="0"/>
                 <wp:positionH relativeFrom="column">
-                  <wp:posOffset>3431540</wp:posOffset>
+                  <wp:posOffset>0</wp:posOffset>
                 </wp:positionH>
                 <wp:positionV relativeFrom="paragraph">
-                  <wp:posOffset>93980</wp:posOffset>
+                  <wp:posOffset>180975</wp:posOffset>
                 </wp:positionV>
                 <wp:extent cx="3200400" cy="3206750"/>
                 <wp:effectExtent l="0" t="0" r="0" b="1905"/>
@@ -2430,16 +3147,6 @@
                         <w:txbxContent>
                           <w:p>
                             <w:pPr>
-                              <w:pStyle w:val="Caption"/>
-                              <w:keepNext/>
-                              <w:jc w:val="center"/>
-                            </w:pPr>
-                            <w:r>
-                              <w:t>FIGURE 2: USE CASE DIAGRAM</w:t>
-                            </w:r>
-                          </w:p>
-                          <w:p>
-                            <w:pPr>
                               <w:jc w:val="center"/>
                             </w:pPr>
                             <w:r>
@@ -2447,10 +3154,10 @@
                                 <w:noProof/>
                               </w:rPr>
                               <w:drawing>
-                                <wp:inline distT="0" distB="0" distL="0" distR="0" wp14:anchorId="1273F2B2" wp14:editId="19071932">
+                                <wp:inline distT="0" distB="0" distL="0" distR="0" wp14:anchorId="69CE14CE" wp14:editId="22010525">
                                   <wp:extent cx="1315085" cy="2866596"/>
                                   <wp:effectExtent l="0" t="0" r="0" b="0"/>
-                                  <wp:docPr id="701404582" name="Picture 12"/>
+                                  <wp:docPr id="219943174" name="Picture 12"/>
                                   <wp:cNvGraphicFramePr>
                                     <a:graphicFrameLocks xmlns:a="http://schemas.openxmlformats.org/drawingml/2006/main" noChangeAspect="1"/>
                                   </wp:cNvGraphicFramePr>
@@ -2464,7 +3171,7 @@
                                           </pic:cNvPicPr>
                                         </pic:nvPicPr>
                                         <pic:blipFill>
-                                          <a:blip r:embed="rId8">
+                                          <a:blip r:embed="rId9">
                                             <a:extLst>
                                               <a:ext uri="{28A0092B-C50C-407E-A947-70E740481C1C}">
                                                 <a14:useLocalDpi xmlns:a14="http://schemas.microsoft.com/office/drawing/2010/main" val="0"/>
@@ -2496,6 +3203,46 @@
                               </w:drawing>
                             </w:r>
                           </w:p>
+                          <w:p>
+                            <w:pPr>
+                              <w:pStyle w:val="Caption"/>
+                              <w:keepNext/>
+                              <w:jc w:val="center"/>
+                              <w:rPr>
+                                <w:color w:val="000000" w:themeColor="text1"/>
+                              </w:rPr>
+                            </w:pPr>
+                            <w:r>
+                              <w:rPr>
+                                <w:color w:val="000000" w:themeColor="text1"/>
+                              </w:rPr>
+                              <w:t>Fig</w:t>
+                            </w:r>
+                            <w:r>
+                              <w:rPr>
+                                <w:color w:val="000000" w:themeColor="text1"/>
+                              </w:rPr>
+                              <w:t>.</w:t>
+                            </w:r>
+                            <w:r>
+                              <w:rPr>
+                                <w:color w:val="000000" w:themeColor="text1"/>
+                              </w:rPr>
+                              <w:t xml:space="preserve"> 2: </w:t>
+                            </w:r>
+                            <w:r>
+                              <w:rPr>
+                                <w:color w:val="000000" w:themeColor="text1"/>
+                              </w:rPr>
+                              <w:t>U</w:t>
+                            </w:r>
+                            <w:r>
+                              <w:rPr>
+                                <w:color w:val="000000" w:themeColor="text1"/>
+                              </w:rPr>
+                              <w:t>se case diagram</w:t>
+                            </w:r>
+                          </w:p>
                         </w:txbxContent>
                       </wps:txbx>
                       <wps:bodyPr rot="0" vert="horz" wrap="square" lIns="91440" tIns="45720" rIns="91440" bIns="45720" anchor="t" anchorCtr="0">
@@ -2515,23 +3262,13 @@
           </mc:Choice>
           <mc:Fallback>
             <w:pict>
-              <v:shapetype w14:anchorId="31E12F1B" id="_x0000_t202" coordsize="21600,21600" o:spt="202" path="m,l,21600r21600,l21600,xe">
+              <v:shapetype w14:anchorId="564E675A" id="_x0000_t202" coordsize="21600,21600" o:spt="202" path="m,l,21600r21600,l21600,xe">
                 <v:stroke joinstyle="miter"/>
                 <v:path gradientshapeok="t" o:connecttype="rect"/>
               </v:shapetype>
-              <v:shape id="Text Box 2" o:spid="_x0000_s1026" type="#_x0000_t202" style="position:absolute;left:0;text-align:left;margin-left:270.2pt;margin-top:7.4pt;width:252pt;height:252.5pt;z-index:251659776;visibility:visible;mso-wrap-style:square;mso-width-percent:0;mso-height-percent:0;mso-wrap-distance-left:9pt;mso-wrap-distance-top:3.6pt;mso-wrap-distance-right:9pt;mso-wrap-distance-bottom:3.6pt;mso-position-horizontal:absolute;mso-position-horizontal-relative:text;mso-position-vertical:absolute;mso-position-vertical-relative:text;mso-width-percent:0;mso-height-percent:0;mso-width-relative:margin;mso-height-relative:margin;v-text-anchor:top" o:gfxdata="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" stroked="f">
+              <v:shape id="Text Box 2" o:spid="_x0000_s1026" type="#_x0000_t202" style="position:absolute;left:0;text-align:left;margin-left:0;margin-top:14.25pt;width:252pt;height:252.5pt;z-index:251659264;visibility:visible;mso-wrap-style:square;mso-width-percent:0;mso-height-percent:0;mso-wrap-distance-left:9pt;mso-wrap-distance-top:3.6pt;mso-wrap-distance-right:9pt;mso-wrap-distance-bottom:3.6pt;mso-position-horizontal:absolute;mso-position-horizontal-relative:text;mso-position-vertical:absolute;mso-position-vertical-relative:text;mso-width-percent:0;mso-height-percent:0;mso-width-relative:margin;mso-height-relative:margin;v-text-anchor:top" o:gfxdata="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" stroked="f">
                 <v:textbox style="mso-fit-shape-to-text:t">
                   <w:txbxContent>
-                    <w:p>
-                      <w:pPr>
-                        <w:pStyle w:val="Caption"/>
-                        <w:keepNext/>
-                        <w:jc w:val="center"/>
-                      </w:pPr>
-                      <w:r>
-                        <w:t>FIGURE 2: USE CASE DIAGRAM</w:t>
-                      </w:r>
-                    </w:p>
                     <w:p>
                       <w:pPr>
                         <w:jc w:val="center"/>
@@ -2541,10 +3278,10 @@
                           <w:noProof/>
                         </w:rPr>
                         <w:drawing>
-                          <wp:inline distT="0" distB="0" distL="0" distR="0" wp14:anchorId="1273F2B2" wp14:editId="19071932">
+                          <wp:inline distT="0" distB="0" distL="0" distR="0" wp14:anchorId="69CE14CE" wp14:editId="22010525">
                             <wp:extent cx="1315085" cy="2866596"/>
                             <wp:effectExtent l="0" t="0" r="0" b="0"/>
-                            <wp:docPr id="701404582" name="Picture 12"/>
+                            <wp:docPr id="219943174" name="Picture 12"/>
                             <wp:cNvGraphicFramePr>
                               <a:graphicFrameLocks xmlns:a="http://schemas.openxmlformats.org/drawingml/2006/main" noChangeAspect="1"/>
                             </wp:cNvGraphicFramePr>
@@ -2558,7 +3295,7 @@
                                     </pic:cNvPicPr>
                                   </pic:nvPicPr>
                                   <pic:blipFill>
-                                    <a:blip r:embed="rId8">
+                                    <a:blip r:embed="rId9">
                                       <a:extLst>
                                         <a:ext uri="{28A0092B-C50C-407E-A947-70E740481C1C}">
                                           <a14:useLocalDpi xmlns:a14="http://schemas.microsoft.com/office/drawing/2010/main" val="0"/>
@@ -2590,6 +3327,46 @@
                         </w:drawing>
                       </w:r>
                     </w:p>
+                    <w:p>
+                      <w:pPr>
+                        <w:pStyle w:val="Caption"/>
+                        <w:keepNext/>
+                        <w:jc w:val="center"/>
+                        <w:rPr>
+                          <w:color w:val="000000" w:themeColor="text1"/>
+                        </w:rPr>
+                      </w:pPr>
+                      <w:r>
+                        <w:rPr>
+                          <w:color w:val="000000" w:themeColor="text1"/>
+                        </w:rPr>
+                        <w:t>Fig</w:t>
+                      </w:r>
+                      <w:r>
+                        <w:rPr>
+                          <w:color w:val="000000" w:themeColor="text1"/>
+                        </w:rPr>
+                        <w:t>.</w:t>
+                      </w:r>
+                      <w:r>
+                        <w:rPr>
+                          <w:color w:val="000000" w:themeColor="text1"/>
+                        </w:rPr>
+                        <w:t xml:space="preserve"> 2: </w:t>
+                      </w:r>
+                      <w:r>
+                        <w:rPr>
+                          <w:color w:val="000000" w:themeColor="text1"/>
+                        </w:rPr>
+                        <w:t>U</w:t>
+                      </w:r>
+                      <w:r>
+                        <w:rPr>
+                          <w:color w:val="000000" w:themeColor="text1"/>
+                        </w:rPr>
+                        <w:t>se case diagram</w:t>
+                      </w:r>
+                    </w:p>
                   </w:txbxContent>
                 </v:textbox>
                 <w10:wrap type="square"/>
@@ -2601,38 +3378,10 @@
       <w:r>
         <w:rPr>
           <w:rFonts w:cs="Times New Roman"/>
+          <w:noProof/>
           <w:szCs w:val="20"/>
         </w:rPr>
-        <w:t>These findings directly informed the prioritisation of the Validation Engine as the primary system contribution and the inclusion of automatic wire cleanup as a planned feature. The full questionnaire instrument and raw response data are included in the Appendices.</w:t>
-      </w:r>
-    </w:p>
-    <w:p>
-      <w:pPr>
-        <w:keepNext/>
-        <w:spacing w:before="120" w:after="60" w:line="228" w:lineRule="auto"/>
-        <w:jc w:val="left"/>
-      </w:pPr>
-      <w:r>
-        <w:rPr>
-          <w:rFonts w:cs="Times New Roman"/>
-          <w:i/>
-          <w:iCs/>
-          <w:szCs w:val="20"/>
-        </w:rPr>
-        <w:t>C. Logical Design</w:t>
-      </w:r>
-    </w:p>
-    <w:p>
-      <w:pPr>
-        <w:spacing w:after="120" w:line="228" w:lineRule="auto"/>
-        <w:ind w:firstLine="288"/>
-      </w:pPr>
-      <w:r>
-        <w:rPr>
-          <w:rFonts w:cs="Times New Roman"/>
-          <w:szCs w:val="20"/>
-        </w:rPr>
-        <w:t>The logical design of Elera describes the system's structure and behaviour through standard UML diagrams. This subsection presents the narrative that accompanies each diagram.</w:t>
+        <w:t xml:space="preserve"> </w:t>
       </w:r>
     </w:p>
     <w:p>
@@ -2647,207 +3396,28 @@
           <w:bCs/>
           <w:szCs w:val="20"/>
         </w:rPr>
-        <w:t xml:space="preserve">System Architecture. </w:t>
+        <w:t xml:space="preserve">Sequence Diagram. </w:t>
       </w:r>
       <w:r>
         <w:rPr>
           <w:rFonts w:cs="Times New Roman"/>
           <w:szCs w:val="20"/>
         </w:rPr>
-        <w:t xml:space="preserve">Elera uses a modular architecture built with Lit 3 Web Components. The system comprises twelve modules that communicate through an event-driven pattern. When a user performs an action on the canvas, such as placing a wire, the Circuit Store updates its internal state and fires a "structural-change" event. The Validation Engine listens for that event, re-checks the circuit, and sends the results to the Validation Bar, which re-renders automatically. The user sees updated feedback without any manual refresh. The twelve modules are: Circuit App, Component Library, Component Sidebar, Circuit Canvas, Placed Component, </w:t>
+        <w:t xml:space="preserve">The Sequence diagram illustrates the validation flow. The interaction begins when the user completes a wire on the Canvas. </w:t>
       </w:r>
       <w:r>
         <w:rPr>
           <w:rFonts w:cs="Times New Roman"/>
           <w:szCs w:val="20"/>
         </w:rPr>
-        <w:t>Circuit Store, Validation Engine, Validation Bar, Auto-Wire Engine, Wire Path Utility, AI Assistant, and Component Builder. The Component Library feeds metadata to the Sidebar, Canvas, Validation Engine, and Auto-Wire Engine. The Canvas and Auto-Wire Engine read from and write to the Store. The Store fires structural-change events to the Validation Engine, which outputs results to the Validation Bar. The AI Assistant reads circuit state from the Store and writes auto-wire actions back to it via the Gemini API. The Component Builder allows users to create custom components and saves the resulting metadata to the Component Library.</w:t>
-      </w:r>
-    </w:p>
-    <w:p>
-      <w:pPr>
-        <w:pStyle w:val="Caption"/>
-        <w:keepNext/>
-        <w:jc w:val="center"/>
-      </w:pPr>
-      <w:r>
-        <w:t xml:space="preserve">FIGURE </w:t>
-      </w:r>
-      <w:r>
-        <w:t>1</w:t>
-      </w:r>
-      <w:r>
-        <w:t>: SYSTEM ARCHITECTURE DIAGRAM</w:t>
-      </w:r>
-    </w:p>
-    <w:p>
-      <w:pPr>
-        <w:spacing w:after="120" w:line="228" w:lineRule="auto"/>
-      </w:pPr>
-      <w:r>
-        <w:rPr>
-          <w:rFonts w:cs="Times New Roman"/>
-          <w:b/>
-          <w:bCs/>
-          <w:noProof/>
+        <w:t>notifies the Store that a wire has been completed</w:t>
+      </w:r>
+      <w:r>
+        <w:rPr>
+          <w:rFonts w:cs="Times New Roman"/>
           <w:szCs w:val="20"/>
         </w:rPr>
-        <w:drawing>
-          <wp:inline distT="0" distB="0" distL="0" distR="0" wp14:anchorId="21C81C67" wp14:editId="0DC85240">
-            <wp:extent cx="3200400" cy="2470150"/>
-            <wp:effectExtent l="0" t="0" r="0" b="6350"/>
-            <wp:docPr id="120644736" name="Picture 6"/>
-            <wp:cNvGraphicFramePr>
-              <a:graphicFrameLocks xmlns:a="http://schemas.openxmlformats.org/drawingml/2006/main" noChangeAspect="1"/>
-            </wp:cNvGraphicFramePr>
-            <a:graphic xmlns:a="http://schemas.openxmlformats.org/drawingml/2006/main">
-              <a:graphicData uri="http://schemas.openxmlformats.org/drawingml/2006/picture">
-                <pic:pic xmlns:pic="http://schemas.openxmlformats.org/drawingml/2006/picture">
-                  <pic:nvPicPr>
-                    <pic:cNvPr id="0" name="Picture 6"/>
-                    <pic:cNvPicPr>
-                      <a:picLocks noChangeAspect="1" noChangeArrowheads="1"/>
-                    </pic:cNvPicPr>
-                  </pic:nvPicPr>
-                  <pic:blipFill>
-                    <a:blip r:embed="rId9">
-                      <a:extLst>
-                        <a:ext uri="{28A0092B-C50C-407E-A947-70E740481C1C}">
-                          <a14:useLocalDpi xmlns:a14="http://schemas.microsoft.com/office/drawing/2010/main" val="0"/>
-                        </a:ext>
-                      </a:extLst>
-                    </a:blip>
-                    <a:srcRect/>
-                    <a:stretch>
-                      <a:fillRect/>
-                    </a:stretch>
-                  </pic:blipFill>
-                  <pic:spPr bwMode="auto">
-                    <a:xfrm>
-                      <a:off x="0" y="0"/>
-                      <a:ext cx="3200400" cy="2470150"/>
-                    </a:xfrm>
-                    <a:prstGeom prst="rect">
-                      <a:avLst/>
-                    </a:prstGeom>
-                    <a:noFill/>
-                    <a:ln>
-                      <a:noFill/>
-                    </a:ln>
-                  </pic:spPr>
-                </pic:pic>
-              </a:graphicData>
-            </a:graphic>
-          </wp:inline>
-        </w:drawing>
-      </w:r>
-    </w:p>
-    <w:p>
-      <w:pPr>
-        <w:spacing w:after="120" w:line="228" w:lineRule="auto"/>
-        <w:ind w:firstLine="288"/>
-      </w:pPr>
-      <w:r>
-        <w:rPr>
-          <w:rFonts w:cs="Times New Roman"/>
-          <w:b/>
-          <w:bCs/>
-          <w:szCs w:val="20"/>
-        </w:rPr>
-        <w:t xml:space="preserve">Use Case Diagram. </w:t>
-      </w:r>
-      <w:r>
-        <w:rPr>
-          <w:rFonts w:cs="Times New Roman"/>
-          <w:szCs w:val="20"/>
-        </w:rPr>
-        <w:t xml:space="preserve">The primary actor in the system is the Student. The Use Case diagram illustrates twelve supported interactions grouped into four packages. Under Component Management: Place Component, Move Component, Delete Component, and Search Components. Under Wiring: Wire Two Pins Manually, Auto-Wire Component, Edit Wire </w:t>
-      </w:r>
-      <w:r>
-        <w:rPr>
-          <w:rFonts w:cs="Times New Roman"/>
-          <w:szCs w:val="20"/>
-        </w:rPr>
-        <w:lastRenderedPageBreak/>
-        <w:t>Waypoints, and Clean Up Wire Routing. Under Validation: View Validation Results. Under Project: Zoom and Pan Canvas, Undo or Redo Action, and Clear Project. Each use case maps to one or more functional requirements defined</w:t>
-      </w:r>
-      <w:r>
-        <w:rPr>
-          <w:rFonts w:cs="Times New Roman"/>
-          <w:szCs w:val="20"/>
-        </w:rPr>
-        <w:t xml:space="preserve"> </w:t>
-      </w:r>
-      <w:r>
-        <w:rPr>
-          <w:rFonts w:cs="Times New Roman"/>
-          <w:szCs w:val="20"/>
-        </w:rPr>
-        <w:t>during the requirements gathering phase.</w:t>
-      </w:r>
-      <w:r>
-        <w:rPr>
-          <w:rFonts w:cs="Times New Roman"/>
-          <w:b/>
-          <w:bCs/>
-          <w:noProof/>
-          <w:szCs w:val="20"/>
-        </w:rPr>
-        <w:t xml:space="preserve"> </w:t>
-      </w:r>
-    </w:p>
-    <w:p>
-      <w:pPr>
-        <w:spacing w:after="120" w:line="228" w:lineRule="auto"/>
-        <w:ind w:firstLine="288"/>
-      </w:pPr>
-      <w:r>
-        <w:rPr>
-          <w:rFonts w:cs="Times New Roman"/>
-          <w:b/>
-          <w:bCs/>
-          <w:szCs w:val="20"/>
-        </w:rPr>
-        <w:t xml:space="preserve">Activity Workflow. </w:t>
-      </w:r>
-      <w:r>
-        <w:rPr>
-          <w:rFonts w:cs="Times New Roman"/>
-          <w:szCs w:val="20"/>
-        </w:rPr>
-        <w:t>The circuit building workflow proceeds as follows. The student places an Arduino Uno on the canvas, followed by one or more components. The student then chooses between manual wiring and auto-wiring. In the manual path, the student clicks a source pin, clicks a destination pin, and a wire appears. In the auto-wire path, the student triggers the engine, pins are assigned, and wires are generated automatically. After either path, the validation engine runs automatically and the student views the results. If errors are present, the student fixes the wiring and the cycle repeats. If no errors are detected, the circuit is complete.</w:t>
-      </w:r>
-    </w:p>
-    <w:p>
-      <w:pPr>
-        <w:spacing w:after="120" w:line="228" w:lineRule="auto"/>
-        <w:ind w:firstLine="288"/>
-      </w:pPr>
-      <w:r>
-        <w:rPr>
-          <w:rFonts w:cs="Times New Roman"/>
-          <w:b/>
-          <w:bCs/>
-          <w:szCs w:val="20"/>
-        </w:rPr>
-        <w:t xml:space="preserve">Sequence Diagram. </w:t>
-      </w:r>
-      <w:r>
-        <w:rPr>
-          <w:rFonts w:cs="Times New Roman"/>
-          <w:szCs w:val="20"/>
-        </w:rPr>
-        <w:t>The Sequence diagram illustrates the validation flow. The interaction begins when the user completes a wire on the Canvas. The Canvas calls Store.completeWiring(). The Store records the wire, saves a history snapshot, and fires a "structural-change" event. The Validation Bar listens for that event, requests validation from the Validation Engine. The Validation Engine reads the current component instances and wires from the Store, runs the nine rules, and returns the results to the Validation Bar. The Validation Bar re-renders the updated issue list, and the user sees the new error and warning counts.</w:t>
-      </w:r>
-    </w:p>
-    <w:p>
-      <w:pPr>
-        <w:pStyle w:val="Caption"/>
-        <w:keepNext/>
-        <w:jc w:val="center"/>
-      </w:pPr>
-      <w:r>
-        <w:t>FIGURE 3: SEQUENCE DIAGRAM</w:t>
+        <w:t>. The Store records the wire, saves a history snapshot, and fires a "structural-change" event. The Validation Bar listens for that event, requests validation from the Validation Engine. The Validation Engine reads the current component instances and wires from the Store, runs the nine rules, and returns the results to the Validation Bar. The Validation Bar re-renders the updated issue list, and the user sees the new error and warning counts.</w:t>
       </w:r>
     </w:p>
     <w:p>
@@ -2910,6 +3480,51 @@
     </w:p>
     <w:p>
       <w:pPr>
+        <w:pStyle w:val="Caption"/>
+        <w:keepNext/>
+        <w:jc w:val="center"/>
+        <w:rPr>
+          <w:color w:val="000000" w:themeColor="text1"/>
+        </w:rPr>
+      </w:pPr>
+      <w:r>
+        <w:rPr>
+          <w:color w:val="000000" w:themeColor="text1"/>
+        </w:rPr>
+        <w:t>Fig</w:t>
+      </w:r>
+      <w:r>
+        <w:rPr>
+          <w:color w:val="000000" w:themeColor="text1"/>
+        </w:rPr>
+        <w:t>.</w:t>
+      </w:r>
+      <w:r>
+        <w:rPr>
+          <w:color w:val="000000" w:themeColor="text1"/>
+        </w:rPr>
+        <w:t xml:space="preserve"> 3: </w:t>
+      </w:r>
+      <w:r>
+        <w:rPr>
+          <w:color w:val="000000" w:themeColor="text1"/>
+        </w:rPr>
+        <w:t>S</w:t>
+      </w:r>
+      <w:r>
+        <w:rPr>
+          <w:color w:val="000000" w:themeColor="text1"/>
+        </w:rPr>
+        <w:t>equence diagram</w:t>
+      </w:r>
+    </w:p>
+    <w:p>
+      <w:pPr>
+        <w:spacing w:after="120" w:line="228" w:lineRule="auto"/>
+      </w:pPr>
+    </w:p>
+    <w:p>
+      <w:pPr>
         <w:keepNext/>
         <w:spacing w:before="120" w:after="60" w:line="228" w:lineRule="auto"/>
         <w:jc w:val="left"/>
@@ -2937,39 +3552,7 @@
         <w:t>T</w:t>
       </w:r>
       <w:r>
-        <w:t xml:space="preserve">he data model is designed around a PostgreSQL database hosted on </w:t>
-      </w:r>
-      <w:proofErr w:type="spellStart"/>
-      <w:r>
-        <w:t>Supabase</w:t>
-      </w:r>
-      <w:proofErr w:type="spellEnd"/>
-      <w:r>
-        <w:t xml:space="preserve">, </w:t>
-      </w:r>
-      <w:proofErr w:type="spellStart"/>
-      <w:r>
-        <w:t>organised</w:t>
-      </w:r>
-      <w:proofErr w:type="spellEnd"/>
-      <w:r>
-        <w:t xml:space="preserve"> into four tables: Users, Projects, </w:t>
-      </w:r>
-      <w:proofErr w:type="spellStart"/>
-      <w:r>
-        <w:t>ComponentInstances</w:t>
-      </w:r>
-      <w:proofErr w:type="spellEnd"/>
-      <w:r>
-        <w:t xml:space="preserve">, and Wires. The Entity-Relationship Diagram (Fig. 4) illustrates the logical relationships between the core entities. A single Component from the metadata library maps to many Instances placed on the canvas, and one Instance connects to many Wires from both source and destination pins. The Users and Projects tables handle account authentication and session management. Within the Wires table, </w:t>
-      </w:r>
-      <w:proofErr w:type="gramStart"/>
-      <w:r>
-        <w:t>routing</w:t>
-      </w:r>
-      <w:proofErr w:type="gramEnd"/>
-      <w:r>
-        <w:t xml:space="preserve"> waypoints are stored dynamically as a JSONB column to accommodate variable-length path arrays without requiring a separate table. The component library definitions are maintained as static metadata in the application layer rather than the database, as they do not change between sessions and are not specific to any user or project.</w:t>
+        <w:t>he data model is designed around a PostgreSQL database hosted on Supabase, organised into four tables: Users, Projects, ComponentInstances, and Wires. The Entity-Relationship Diagram (Fig. 4) illustrates the logical relationships between the core entities. A single Component from the metadata library maps to many Instances placed on the canvas, and one Instance connects to many Wires from both source and destination pins. The Users and Projects tables handle account authentication and session management. Within the Wires table, routing waypoints are stored dynamically as a JSONB column to accommodate variable-length path arrays without requiring a separate table. The component library definitions are maintained as static metadata in the application layer rather than the database, as they do not change between sessions and are not specific to any user or project.</w:t>
       </w:r>
       <w:r>
         <w:rPr>
@@ -2983,24 +3566,6 @@
     <w:p>
       <w:pPr>
         <w:spacing w:after="120" w:line="228" w:lineRule="auto"/>
-        <w:ind w:firstLine="288"/>
-      </w:pPr>
-    </w:p>
-    <w:p>
-      <w:pPr>
-        <w:pStyle w:val="Caption"/>
-        <w:keepNext/>
-        <w:jc w:val="center"/>
-      </w:pPr>
-      <w:r>
-        <w:t>FIGURE 4: ERD DIAGRAM</w:t>
-      </w:r>
-    </w:p>
-    <w:p>
-      <w:pPr>
-        <w:spacing w:after="120" w:line="228" w:lineRule="auto"/>
-        <w:ind w:firstLine="288"/>
-        <w:jc w:val="center"/>
       </w:pPr>
       <w:r>
         <w:rPr>
@@ -3009,10 +3574,10 @@
           <w:szCs w:val="20"/>
         </w:rPr>
         <w:drawing>
-          <wp:inline distT="0" distB="0" distL="0" distR="0" wp14:anchorId="0F06D3B8" wp14:editId="3722E424">
-            <wp:extent cx="1440174" cy="3657600"/>
-            <wp:effectExtent l="0" t="0" r="8255" b="0"/>
-            <wp:docPr id="1587219837" name="Picture 1"/>
+          <wp:inline distT="0" distB="0" distL="0" distR="0" wp14:anchorId="0AEA2E83" wp14:editId="00D5FB90">
+            <wp:extent cx="3228340" cy="3506470"/>
+            <wp:effectExtent l="0" t="0" r="0" b="0"/>
+            <wp:docPr id="162890946" name="Picture 15"/>
             <wp:cNvGraphicFramePr>
               <a:graphicFrameLocks xmlns:a="http://schemas.openxmlformats.org/drawingml/2006/main" noChangeAspect="1"/>
             </wp:cNvGraphicFramePr>
@@ -3020,7 +3585,7 @@
               <a:graphicData uri="http://schemas.openxmlformats.org/drawingml/2006/picture">
                 <pic:pic xmlns:pic="http://schemas.openxmlformats.org/drawingml/2006/picture">
                   <pic:nvPicPr>
-                    <pic:cNvPr id="0" name="Picture 1"/>
+                    <pic:cNvPr id="0" name="Picture 15"/>
                     <pic:cNvPicPr>
                       <a:picLocks noChangeAspect="1" noChangeArrowheads="1"/>
                     </pic:cNvPicPr>
@@ -3041,7 +3606,7 @@
                   <pic:spPr bwMode="auto">
                     <a:xfrm>
                       <a:off x="0" y="0"/>
-                      <a:ext cx="1445708" cy="3671656"/>
+                      <a:ext cx="3228340" cy="3506470"/>
                     </a:xfrm>
                     <a:prstGeom prst="rect">
                       <a:avLst/>
@@ -3063,12 +3628,242 @@
         <w:spacing w:after="120" w:line="228" w:lineRule="auto"/>
         <w:ind w:firstLine="288"/>
       </w:pPr>
-      <w:r>
+    </w:p>
+    <w:p>
+      <w:pPr>
+        <w:pStyle w:val="Caption"/>
+        <w:keepNext/>
+        <w:jc w:val="center"/>
+        <w:rPr>
+          <w:color w:val="000000" w:themeColor="text1"/>
+        </w:rPr>
+      </w:pPr>
+      <w:r>
+        <w:rPr>
+          <w:color w:val="000000" w:themeColor="text1"/>
+        </w:rPr>
+        <w:t>Fi</w:t>
+      </w:r>
+      <w:r>
+        <w:rPr>
+          <w:color w:val="000000" w:themeColor="text1"/>
+        </w:rPr>
+        <w:t>g.</w:t>
+      </w:r>
+      <w:r>
+        <w:rPr>
+          <w:color w:val="000000" w:themeColor="text1"/>
+        </w:rPr>
+        <w:t xml:space="preserve"> 4: </w:t>
+      </w:r>
+      <w:r>
+        <w:rPr>
+          <w:color w:val="000000" w:themeColor="text1"/>
+        </w:rPr>
+        <w:t>ERD</w:t>
+      </w:r>
+      <w:r>
+        <w:rPr>
+          <w:color w:val="000000" w:themeColor="text1"/>
+        </w:rPr>
+        <w:t xml:space="preserve"> diagram</w:t>
+      </w:r>
+    </w:p>
+    <w:p>
+      <w:pPr>
+        <w:spacing w:after="120" w:line="228" w:lineRule="auto"/>
+        <w:ind w:firstLine="288"/>
         <w:rPr>
           <w:rFonts w:cs="Times New Roman"/>
           <w:szCs w:val="20"/>
         </w:rPr>
-        <w:t>The Users table stores account information for each registered student, including a UUID primary key, name, email address, and account creation timestamp. The Projects table represents a saved circuit design. Each project belongs to one user through a foreign key relationship and stores a title and the timestamp of the last modification. The ComponentInstances table records each component placed on the canvas for a given project. It stores the component type identifier, which maps to the static component library definition, and the canvas position coordinates. The Wires table stores each wire connection between two component pins. The source and destination are recorded as foreign keys to ComponentInstances along with the specific pin names. Wire routing waypoints are stored as a JSONB column to accommodate variable-length path arrays without requiring a separate table. The wire colour is stored as a string and is assigned automatically based on signal type during rendering.</w:t>
+        <w:sectPr>
+          <w:type w:val="continuous"/>
+          <w:pgSz w:w="12240" w:h="15840"/>
+          <w:pgMar w:top="1080" w:right="893" w:bottom="1440" w:left="893" w:header="720" w:footer="720" w:gutter="0"/>
+          <w:cols w:num="2" w:space="360"/>
+          <w:docGrid w:linePitch="360"/>
+        </w:sectPr>
+      </w:pPr>
+      <w:r>
+        <w:rPr>
+          <w:rFonts w:cs="Times New Roman"/>
+          <w:szCs w:val="20"/>
+        </w:rPr>
+        <w:t xml:space="preserve">The Users table stores account information for each registered student, including a UUID primary key, name, email address, and account creation timestamp. The Projects table represents a saved circuit design. Each project belongs to one user through a foreign key relationship and stores a title and the timestamp of the last modification. The ComponentInstances table records each component placed on the canvas for a given project. It stores the component type identifier, which maps to the static component library definition, and the canvas position coordinates. The Wires table stores each wire connection between two component pins. The source and destination are recorded as foreign keys to ComponentInstances along with the specific pin names. </w:t>
+      </w:r>
+    </w:p>
+    <w:p>
+      <w:pPr>
+        <w:spacing w:after="120" w:line="228" w:lineRule="auto"/>
+        <w:ind w:firstLine="288"/>
+        <w:jc w:val="center"/>
+        <w:rPr>
+          <w:rFonts w:cs="Times New Roman"/>
+          <w:szCs w:val="20"/>
+        </w:rPr>
+      </w:pPr>
+      <w:r>
+        <w:rPr>
+          <w:rFonts w:cs="Times New Roman"/>
+          <w:noProof/>
+          <w:szCs w:val="20"/>
+        </w:rPr>
+        <w:lastRenderedPageBreak/>
+        <w:drawing>
+          <wp:inline distT="0" distB="0" distL="0" distR="0" wp14:anchorId="0C6D63B7" wp14:editId="29072BF7">
+            <wp:extent cx="5885789" cy="2921330"/>
+            <wp:effectExtent l="0" t="0" r="1270" b="0"/>
+            <wp:docPr id="608205738" name="Picture 4"/>
+            <wp:cNvGraphicFramePr>
+              <a:graphicFrameLocks xmlns:a="http://schemas.openxmlformats.org/drawingml/2006/main" noChangeAspect="1"/>
+            </wp:cNvGraphicFramePr>
+            <a:graphic xmlns:a="http://schemas.openxmlformats.org/drawingml/2006/main">
+              <a:graphicData uri="http://schemas.openxmlformats.org/drawingml/2006/picture">
+                <pic:pic xmlns:pic="http://schemas.openxmlformats.org/drawingml/2006/picture">
+                  <pic:nvPicPr>
+                    <pic:cNvPr id="0" name="Picture 3"/>
+                    <pic:cNvPicPr>
+                      <a:picLocks noChangeAspect="1" noChangeArrowheads="1"/>
+                    </pic:cNvPicPr>
+                  </pic:nvPicPr>
+                  <pic:blipFill>
+                    <a:blip r:embed="rId12">
+                      <a:extLst>
+                        <a:ext uri="{28A0092B-C50C-407E-A947-70E740481C1C}">
+                          <a14:useLocalDpi xmlns:a14="http://schemas.microsoft.com/office/drawing/2010/main" val="0"/>
+                        </a:ext>
+                      </a:extLst>
+                    </a:blip>
+                    <a:srcRect/>
+                    <a:stretch>
+                      <a:fillRect/>
+                    </a:stretch>
+                  </pic:blipFill>
+                  <pic:spPr bwMode="auto">
+                    <a:xfrm>
+                      <a:off x="0" y="0"/>
+                      <a:ext cx="5890430" cy="2923633"/>
+                    </a:xfrm>
+                    <a:prstGeom prst="rect">
+                      <a:avLst/>
+                    </a:prstGeom>
+                    <a:noFill/>
+                    <a:ln>
+                      <a:noFill/>
+                    </a:ln>
+                  </pic:spPr>
+                </pic:pic>
+              </a:graphicData>
+            </a:graphic>
+          </wp:inline>
+        </w:drawing>
+      </w:r>
+    </w:p>
+    <w:p>
+      <w:pPr>
+        <w:pStyle w:val="Caption"/>
+        <w:keepNext/>
+        <w:jc w:val="center"/>
+        <w:rPr>
+          <w:color w:val="000000" w:themeColor="text1"/>
+        </w:rPr>
+      </w:pPr>
+      <w:r>
+        <w:rPr>
+          <w:color w:val="000000" w:themeColor="text1"/>
+        </w:rPr>
+        <w:t>Fig</w:t>
+      </w:r>
+      <w:r>
+        <w:rPr>
+          <w:color w:val="000000" w:themeColor="text1"/>
+        </w:rPr>
+        <w:t>.</w:t>
+      </w:r>
+      <w:r>
+        <w:rPr>
+          <w:color w:val="000000" w:themeColor="text1"/>
+        </w:rPr>
+        <w:t xml:space="preserve"> 5: </w:t>
+      </w:r>
+      <w:proofErr w:type="spellStart"/>
+      <w:r>
+        <w:rPr>
+          <w:color w:val="000000" w:themeColor="text1"/>
+        </w:rPr>
+        <w:t>elera</w:t>
+      </w:r>
+      <w:proofErr w:type="spellEnd"/>
+      <w:r>
+        <w:rPr>
+          <w:color w:val="000000" w:themeColor="text1"/>
+        </w:rPr>
+        <w:t xml:space="preserve"> user interface prototype displaying the component sidebar, central canvas, and ai assistant</w:t>
+      </w:r>
+    </w:p>
+    <w:p>
+      <w:pPr>
+        <w:spacing w:after="120" w:line="228" w:lineRule="auto"/>
+        <w:ind w:firstLine="288"/>
+        <w:jc w:val="center"/>
+        <w:rPr>
+          <w:rFonts w:cs="Times New Roman"/>
+          <w:szCs w:val="20"/>
+        </w:rPr>
+        <w:sectPr>
+          <w:type w:val="continuous"/>
+          <w:pgSz w:w="12240" w:h="15840"/>
+          <w:pgMar w:top="1080" w:right="893" w:bottom="1440" w:left="893" w:header="720" w:footer="720" w:gutter="0"/>
+          <w:cols w:space="360"/>
+          <w:docGrid w:linePitch="360"/>
+        </w:sectPr>
+      </w:pPr>
+    </w:p>
+    <w:p>
+      <w:pPr>
+        <w:spacing w:after="120" w:line="228" w:lineRule="auto"/>
+        <w:ind w:firstLine="288"/>
+        <w:rPr>
+          <w:rFonts w:cs="Times New Roman"/>
+          <w:szCs w:val="20"/>
+        </w:rPr>
+        <w:sectPr>
+          <w:type w:val="continuous"/>
+          <w:pgSz w:w="12240" w:h="15840"/>
+          <w:pgMar w:top="1080" w:right="893" w:bottom="1440" w:left="893" w:header="720" w:footer="720" w:gutter="0"/>
+          <w:cols w:num="2" w:space="360"/>
+          <w:docGrid w:linePitch="360"/>
+        </w:sectPr>
+      </w:pPr>
+    </w:p>
+    <w:p>
+      <w:pPr>
+        <w:spacing w:after="120" w:line="228" w:lineRule="auto"/>
+        <w:ind w:firstLine="288"/>
+      </w:pPr>
+      <w:r>
+        <w:rPr>
+          <w:rFonts w:cs="Times New Roman"/>
+          <w:szCs w:val="20"/>
+        </w:rPr>
+        <w:t xml:space="preserve">Wire </w:t>
+      </w:r>
+      <w:proofErr w:type="gramStart"/>
+      <w:r>
+        <w:rPr>
+          <w:rFonts w:cs="Times New Roman"/>
+          <w:szCs w:val="20"/>
+        </w:rPr>
+        <w:t>routing</w:t>
+      </w:r>
+      <w:proofErr w:type="gramEnd"/>
+      <w:r>
+        <w:rPr>
+          <w:rFonts w:cs="Times New Roman"/>
+          <w:szCs w:val="20"/>
+        </w:rPr>
+        <w:t xml:space="preserve"> waypoints are stored as a JSONB column to accommodate variable-length path arrays without requiring a separate table. The wire colour is stored as a string and is assigned automatically based on signal type during rendering.</w:t>
       </w:r>
     </w:p>
     <w:p>
@@ -3113,79 +3908,21 @@
           <w:rFonts w:cs="Times New Roman"/>
           <w:szCs w:val="20"/>
         </w:rPr>
-        <w:t xml:space="preserve">The user interface prototype follows a three-panel layout: a header toolbar, a component sidebar, and a large central circuit canvas (Fig. 5). The canvas serves as the primary workspace, supporting drag-and-drop placement, grid-snapped movement, and interactive pin-to-pin wiring. Components are rendered using </w:t>
-      </w:r>
-      <w:proofErr w:type="gramStart"/>
+        <w:t>The user interface prototype follows a three-panel layout: a header toolbar, a component sidebar, and a large central circuit canvas (Fig. 5). The canvas serves as the primary workspace, supporting drag-and-drop placement, grid-snapped movement, and interactive pin-to-pin wiring. Components are rendered using the @wokwi/elements library, which provides realistic SVG visuals of actual Arduino parts.  A validation bar sits as an overlay inside the canvas area. It updates automatically whenever the circuit changes, displaying a scrollable list of colour-coded validation messages (red for errors, amber for warnings, blue for informational notes) so the user always sees the current state of the circuit.  To address the usability pain points identified in existing tools , the interface includes automation tools accessible via the header toolbar. When a user triggers auto-wire on a component, the engine automatically creates and routes wires to the appropriate Arduino pins. Furthermore, a wire cleanup feature utilises an orthogonal pathfinding algorithm to re-route all existing wires,</w:t>
+      </w:r>
       <w:r>
         <w:rPr>
           <w:rFonts w:cs="Times New Roman"/>
           <w:szCs w:val="20"/>
         </w:rPr>
-        <w:t>the @</w:t>
-      </w:r>
-      <w:proofErr w:type="gramEnd"/>
+        <w:t xml:space="preserve"> </w:t>
+      </w:r>
       <w:r>
         <w:rPr>
           <w:rFonts w:cs="Times New Roman"/>
           <w:szCs w:val="20"/>
         </w:rPr>
-        <w:t xml:space="preserve">wokwi/elements library, which provides realistic </w:t>
-      </w:r>
-      <w:r>
-        <w:rPr>
-          <w:rFonts w:cs="Times New Roman"/>
-          <w:szCs w:val="20"/>
-        </w:rPr>
-        <w:lastRenderedPageBreak/>
-        <w:t xml:space="preserve">SVG visuals of actual Arduino parts.  A validation bar sits as an overlay inside the canvas area. It updates automatically whenever the circuit changes, displaying a scrollable list of </w:t>
-      </w:r>
-      <w:proofErr w:type="spellStart"/>
-      <w:r>
-        <w:rPr>
-          <w:rFonts w:cs="Times New Roman"/>
-          <w:szCs w:val="20"/>
-        </w:rPr>
-        <w:t>colour</w:t>
-      </w:r>
-      <w:proofErr w:type="spellEnd"/>
-      <w:r>
-        <w:rPr>
-          <w:rFonts w:cs="Times New Roman"/>
-          <w:szCs w:val="20"/>
-        </w:rPr>
-        <w:t xml:space="preserve">-coded validation messages (red for errors, amber for warnings, blue for informational notes) so the user always sees the current state of the circuit.  To address the usability pain points identified in existing </w:t>
-      </w:r>
-      <w:proofErr w:type="gramStart"/>
-      <w:r>
-        <w:rPr>
-          <w:rFonts w:cs="Times New Roman"/>
-          <w:szCs w:val="20"/>
-        </w:rPr>
-        <w:t>tools ,</w:t>
-      </w:r>
-      <w:proofErr w:type="gramEnd"/>
-      <w:r>
-        <w:rPr>
-          <w:rFonts w:cs="Times New Roman"/>
-          <w:szCs w:val="20"/>
-        </w:rPr>
-        <w:t xml:space="preserve"> the interface includes automation tools accessible via the header toolbar. When a user triggers auto-wire on a component, the engine automatically creates and routes wires to the appropriate Arduino pins. Furthermore, a wire cleanup feature </w:t>
-      </w:r>
-      <w:proofErr w:type="spellStart"/>
-      <w:r>
-        <w:rPr>
-          <w:rFonts w:cs="Times New Roman"/>
-          <w:szCs w:val="20"/>
-        </w:rPr>
-        <w:t>utilises</w:t>
-      </w:r>
-      <w:proofErr w:type="spellEnd"/>
-      <w:r>
-        <w:rPr>
-          <w:rFonts w:cs="Times New Roman"/>
-          <w:szCs w:val="20"/>
-        </w:rPr>
-        <w:t xml:space="preserve"> an orthogonal pathfinding algorithm to re-route all existing wires, cleaning up crossed or overlapping paths with a single action.  [INSERT FIG. 5: ELERA USER INTERFACE PROTOTYPE (a) Canvas and Toolbar, (b) Component Sidebar, (c) Validation Bar HERE]</w:t>
+        <w:t xml:space="preserve">cleaning up crossed or overlapping paths with a single action.  </w:t>
       </w:r>
     </w:p>
     <w:p>
@@ -3770,7 +4507,7 @@
     <w:lsdException w:name="Table Web 2" w:semiHidden="1" w:unhideWhenUsed="1"/>
     <w:lsdException w:name="Table Web 3" w:semiHidden="1" w:unhideWhenUsed="1"/>
     <w:lsdException w:name="Balloon Text" w:semiHidden="1" w:unhideWhenUsed="1"/>
-    <w:lsdException w:name="Table Grid" w:uiPriority="59"/>
+    <w:lsdException w:name="Table Grid" w:uiPriority="39"/>
     <w:lsdException w:name="Table Theme" w:semiHidden="1" w:unhideWhenUsed="1"/>
     <w:lsdException w:name="Placeholder Text" w:semiHidden="1"/>
     <w:lsdException w:name="No Spacing" w:uiPriority="1" w:qFormat="1"/>
@@ -4206,6 +4943,7 @@
   <w:style w:type="character" w:default="1" w:styleId="DefaultParagraphFont">
     <w:name w:val="Default Paragraph Font"/>
     <w:uiPriority w:val="1"/>
+    <w:semiHidden/>
     <w:unhideWhenUsed/>
   </w:style>
   <w:style w:type="table" w:default="1" w:styleId="TableNormal">
@@ -4930,7 +5668,7 @@
   <w:style w:type="table" w:styleId="TableGrid">
     <w:name w:val="Table Grid"/>
     <w:basedOn w:val="TableNormal"/>
-    <w:uiPriority w:val="59"/>
+    <w:uiPriority w:val="39"/>
     <w:rsid w:val="00FC693F"/>
     <w:pPr>
       <w:spacing w:after="0" w:line="240" w:lineRule="auto"/>

</xml_diff>